<commit_message>
Populate Table of Contents with entries, dot leaders and page numbers
</commit_message>
<xml_diff>
--- a/thesis/Fake_News_Detection_Uzbek_BTEC_Thesis.docx
+++ b/thesis/Fake_News_Detection_Uzbek_BTEC_Thesis.docx
@@ -546,7 +546,11 @@
     </w:p>
     <w:p>
       <w:pPr>
-        <w:spacing w:after="120" w:line="360" w:lineRule="auto"/>
+        <w:pStyle w:val="TOC1"/>
+        <w:tabs>
+          <w:tab w:val="right" w:leader="dot" w:pos="9355"/>
+        </w:tabs>
+        <w:spacing w:after="60" w:line="360" w:lineRule="auto"/>
       </w:pPr>
       <w:r>
         <w:fldChar w:fldCharType="begin"/>
@@ -559,10 +563,3066 @@
       </w:r>
       <w:r>
         <w:rPr>
+          <w:rFonts w:ascii="Times New Roman" w:hAnsi="Times New Roman" w:cs="Times New Roman"/>
+          <w:b/>
+          <w:sz w:val="28"/>
+          <w:szCs w:val="28"/>
+        </w:rPr>
+        <w:t xml:space="preserve">Declaration of Originality</w:t>
+      </w:r>
+      <w:r>
+        <w:rPr>
           <w:rFonts w:ascii="Times New Roman" w:hAnsi="Times New Roman"/>
           <w:sz w:val="28"/>
         </w:rPr>
-        <w:t xml:space="preserve">Right-click and choose "Update Field" to build the table of contents.</w:t>
+        <w:tab/>
+      </w:r>
+      <w:r>
+        <w:rPr>
+          <w:rFonts w:ascii="Times New Roman" w:hAnsi="Times New Roman" w:cs="Times New Roman"/>
+          <w:b/>
+          <w:sz w:val="28"/>
+          <w:szCs w:val="28"/>
+        </w:rPr>
+        <w:t xml:space="preserve">2</w:t>
+      </w:r>
+    </w:p>
+    <w:p>
+      <w:pPr>
+        <w:pStyle w:val="TOC1"/>
+        <w:tabs>
+          <w:tab w:val="right" w:leader="dot" w:pos="9355"/>
+        </w:tabs>
+        <w:spacing w:after="60" w:line="360" w:lineRule="auto"/>
+      </w:pPr>
+      <w:r>
+        <w:rPr>
+          <w:rFonts w:ascii="Times New Roman" w:hAnsi="Times New Roman" w:cs="Times New Roman"/>
+          <w:b/>
+          <w:sz w:val="28"/>
+          <w:szCs w:val="28"/>
+        </w:rPr>
+        <w:t xml:space="preserve">Acknowledgements</w:t>
+      </w:r>
+      <w:r>
+        <w:rPr>
+          <w:rFonts w:ascii="Times New Roman" w:hAnsi="Times New Roman"/>
+          <w:sz w:val="28"/>
+        </w:rPr>
+        <w:tab/>
+      </w:r>
+      <w:r>
+        <w:rPr>
+          <w:rFonts w:ascii="Times New Roman" w:hAnsi="Times New Roman" w:cs="Times New Roman"/>
+          <w:b/>
+          <w:sz w:val="28"/>
+          <w:szCs w:val="28"/>
+        </w:rPr>
+        <w:t xml:space="preserve">3</w:t>
+      </w:r>
+    </w:p>
+    <w:p>
+      <w:pPr>
+        <w:pStyle w:val="TOC1"/>
+        <w:tabs>
+          <w:tab w:val="right" w:leader="dot" w:pos="9355"/>
+        </w:tabs>
+        <w:spacing w:after="60" w:line="360" w:lineRule="auto"/>
+      </w:pPr>
+      <w:r>
+        <w:rPr>
+          <w:rFonts w:ascii="Times New Roman" w:hAnsi="Times New Roman" w:cs="Times New Roman"/>
+          <w:b/>
+          <w:sz w:val="28"/>
+          <w:szCs w:val="28"/>
+        </w:rPr>
+        <w:t xml:space="preserve">Abstract</w:t>
+      </w:r>
+      <w:r>
+        <w:rPr>
+          <w:rFonts w:ascii="Times New Roman" w:hAnsi="Times New Roman"/>
+          <w:sz w:val="28"/>
+        </w:rPr>
+        <w:tab/>
+      </w:r>
+      <w:r>
+        <w:rPr>
+          <w:rFonts w:ascii="Times New Roman" w:hAnsi="Times New Roman" w:cs="Times New Roman"/>
+          <w:b/>
+          <w:sz w:val="28"/>
+          <w:szCs w:val="28"/>
+        </w:rPr>
+        <w:t xml:space="preserve">4</w:t>
+      </w:r>
+    </w:p>
+    <w:p>
+      <w:pPr>
+        <w:pStyle w:val="TOC1"/>
+        <w:tabs>
+          <w:tab w:val="right" w:leader="dot" w:pos="9355"/>
+        </w:tabs>
+        <w:spacing w:after="60" w:line="360" w:lineRule="auto"/>
+      </w:pPr>
+      <w:r>
+        <w:rPr>
+          <w:rFonts w:ascii="Times New Roman" w:hAnsi="Times New Roman" w:cs="Times New Roman"/>
+          <w:b/>
+          <w:sz w:val="28"/>
+          <w:szCs w:val="28"/>
+        </w:rPr>
+        <w:t xml:space="preserve">Table of Contents</w:t>
+      </w:r>
+      <w:r>
+        <w:rPr>
+          <w:rFonts w:ascii="Times New Roman" w:hAnsi="Times New Roman"/>
+          <w:sz w:val="28"/>
+        </w:rPr>
+        <w:tab/>
+      </w:r>
+      <w:r>
+        <w:rPr>
+          <w:rFonts w:ascii="Times New Roman" w:hAnsi="Times New Roman" w:cs="Times New Roman"/>
+          <w:b/>
+          <w:sz w:val="28"/>
+          <w:szCs w:val="28"/>
+        </w:rPr>
+        <w:t xml:space="preserve">5</w:t>
+      </w:r>
+    </w:p>
+    <w:p>
+      <w:pPr>
+        <w:pStyle w:val="TOC1"/>
+        <w:tabs>
+          <w:tab w:val="right" w:leader="dot" w:pos="9355"/>
+        </w:tabs>
+        <w:spacing w:after="60" w:line="360" w:lineRule="auto"/>
+      </w:pPr>
+      <w:r>
+        <w:rPr>
+          <w:rFonts w:ascii="Times New Roman" w:hAnsi="Times New Roman" w:cs="Times New Roman"/>
+          <w:b/>
+          <w:sz w:val="28"/>
+          <w:szCs w:val="28"/>
+        </w:rPr>
+        <w:t xml:space="preserve">List of Figures</w:t>
+      </w:r>
+      <w:r>
+        <w:rPr>
+          <w:rFonts w:ascii="Times New Roman" w:hAnsi="Times New Roman"/>
+          <w:sz w:val="28"/>
+        </w:rPr>
+        <w:tab/>
+      </w:r>
+      <w:r>
+        <w:rPr>
+          <w:rFonts w:ascii="Times New Roman" w:hAnsi="Times New Roman" w:cs="Times New Roman"/>
+          <w:b/>
+          <w:sz w:val="28"/>
+          <w:szCs w:val="28"/>
+        </w:rPr>
+        <w:t xml:space="preserve">9</w:t>
+      </w:r>
+    </w:p>
+    <w:p>
+      <w:pPr>
+        <w:pStyle w:val="TOC1"/>
+        <w:tabs>
+          <w:tab w:val="right" w:leader="dot" w:pos="9355"/>
+        </w:tabs>
+        <w:spacing w:after="60" w:line="360" w:lineRule="auto"/>
+      </w:pPr>
+      <w:r>
+        <w:rPr>
+          <w:rFonts w:ascii="Times New Roman" w:hAnsi="Times New Roman" w:cs="Times New Roman"/>
+          <w:b/>
+          <w:sz w:val="28"/>
+          <w:szCs w:val="28"/>
+        </w:rPr>
+        <w:t xml:space="preserve">List of Tables</w:t>
+      </w:r>
+      <w:r>
+        <w:rPr>
+          <w:rFonts w:ascii="Times New Roman" w:hAnsi="Times New Roman"/>
+          <w:sz w:val="28"/>
+        </w:rPr>
+        <w:tab/>
+      </w:r>
+      <w:r>
+        <w:rPr>
+          <w:rFonts w:ascii="Times New Roman" w:hAnsi="Times New Roman" w:cs="Times New Roman"/>
+          <w:b/>
+          <w:sz w:val="28"/>
+          <w:szCs w:val="28"/>
+        </w:rPr>
+        <w:t xml:space="preserve">10</w:t>
+      </w:r>
+    </w:p>
+    <w:p>
+      <w:pPr>
+        <w:pStyle w:val="TOC1"/>
+        <w:tabs>
+          <w:tab w:val="right" w:leader="dot" w:pos="9355"/>
+        </w:tabs>
+        <w:spacing w:after="60" w:line="360" w:lineRule="auto"/>
+      </w:pPr>
+      <w:r>
+        <w:rPr>
+          <w:rFonts w:ascii="Times New Roman" w:hAnsi="Times New Roman" w:cs="Times New Roman"/>
+          <w:b/>
+          <w:sz w:val="28"/>
+          <w:szCs w:val="28"/>
+        </w:rPr>
+        <w:t xml:space="preserve">List of Abbreviations</w:t>
+      </w:r>
+      <w:r>
+        <w:rPr>
+          <w:rFonts w:ascii="Times New Roman" w:hAnsi="Times New Roman"/>
+          <w:sz w:val="28"/>
+        </w:rPr>
+        <w:tab/>
+      </w:r>
+      <w:r>
+        <w:rPr>
+          <w:rFonts w:ascii="Times New Roman" w:hAnsi="Times New Roman" w:cs="Times New Roman"/>
+          <w:b/>
+          <w:sz w:val="28"/>
+          <w:szCs w:val="28"/>
+        </w:rPr>
+        <w:t xml:space="preserve">11</w:t>
+      </w:r>
+    </w:p>
+    <w:p>
+      <w:pPr>
+        <w:pStyle w:val="TOC1"/>
+        <w:tabs>
+          <w:tab w:val="right" w:leader="dot" w:pos="9355"/>
+        </w:tabs>
+        <w:spacing w:after="60" w:line="360" w:lineRule="auto"/>
+      </w:pPr>
+      <w:r>
+        <w:rPr>
+          <w:rFonts w:ascii="Times New Roman" w:hAnsi="Times New Roman" w:cs="Times New Roman"/>
+          <w:b/>
+          <w:sz w:val="28"/>
+          <w:szCs w:val="28"/>
+        </w:rPr>
+        <w:t xml:space="preserve">Chapter 1 — Introduction</w:t>
+      </w:r>
+      <w:r>
+        <w:rPr>
+          <w:rFonts w:ascii="Times New Roman" w:hAnsi="Times New Roman"/>
+          <w:sz w:val="28"/>
+        </w:rPr>
+        <w:tab/>
+      </w:r>
+      <w:r>
+        <w:rPr>
+          <w:rFonts w:ascii="Times New Roman" w:hAnsi="Times New Roman" w:cs="Times New Roman"/>
+          <w:b/>
+          <w:sz w:val="28"/>
+          <w:szCs w:val="28"/>
+        </w:rPr>
+        <w:t xml:space="preserve">13</w:t>
+      </w:r>
+    </w:p>
+    <w:p>
+      <w:pPr>
+        <w:pStyle w:val="TOC2"/>
+        <w:tabs>
+          <w:tab w:val="right" w:leader="dot" w:pos="9355"/>
+        </w:tabs>
+        <w:spacing w:after="60" w:line="360" w:lineRule="auto"/>
+      </w:pPr>
+      <w:r>
+        <w:rPr>
+          <w:rFonts w:ascii="Times New Roman" w:hAnsi="Times New Roman" w:cs="Times New Roman"/>
+          <w:sz w:val="28"/>
+          <w:szCs w:val="28"/>
+        </w:rPr>
+        <w:t xml:space="preserve">1.1 Background and Context</w:t>
+      </w:r>
+      <w:r>
+        <w:rPr>
+          <w:rFonts w:ascii="Times New Roman" w:hAnsi="Times New Roman"/>
+          <w:sz w:val="28"/>
+        </w:rPr>
+        <w:tab/>
+      </w:r>
+      <w:r>
+        <w:rPr>
+          <w:rFonts w:ascii="Times New Roman" w:hAnsi="Times New Roman" w:cs="Times New Roman"/>
+          <w:sz w:val="28"/>
+          <w:szCs w:val="28"/>
+        </w:rPr>
+        <w:t xml:space="preserve">13</w:t>
+      </w:r>
+    </w:p>
+    <w:p>
+      <w:pPr>
+        <w:pStyle w:val="TOC2"/>
+        <w:tabs>
+          <w:tab w:val="right" w:leader="dot" w:pos="9355"/>
+        </w:tabs>
+        <w:spacing w:after="60" w:line="360" w:lineRule="auto"/>
+      </w:pPr>
+      <w:r>
+        <w:rPr>
+          <w:rFonts w:ascii="Times New Roman" w:hAnsi="Times New Roman" w:cs="Times New Roman"/>
+          <w:sz w:val="28"/>
+          <w:szCs w:val="28"/>
+        </w:rPr>
+        <w:t xml:space="preserve">1.2 Problem Statement</w:t>
+      </w:r>
+      <w:r>
+        <w:rPr>
+          <w:rFonts w:ascii="Times New Roman" w:hAnsi="Times New Roman"/>
+          <w:sz w:val="28"/>
+        </w:rPr>
+        <w:tab/>
+      </w:r>
+      <w:r>
+        <w:rPr>
+          <w:rFonts w:ascii="Times New Roman" w:hAnsi="Times New Roman" w:cs="Times New Roman"/>
+          <w:sz w:val="28"/>
+          <w:szCs w:val="28"/>
+        </w:rPr>
+        <w:t xml:space="preserve">14</w:t>
+      </w:r>
+    </w:p>
+    <w:p>
+      <w:pPr>
+        <w:pStyle w:val="TOC2"/>
+        <w:tabs>
+          <w:tab w:val="right" w:leader="dot" w:pos="9355"/>
+        </w:tabs>
+        <w:spacing w:after="60" w:line="360" w:lineRule="auto"/>
+      </w:pPr>
+      <w:r>
+        <w:rPr>
+          <w:rFonts w:ascii="Times New Roman" w:hAnsi="Times New Roman" w:cs="Times New Roman"/>
+          <w:sz w:val="28"/>
+          <w:szCs w:val="28"/>
+        </w:rPr>
+        <w:t xml:space="preserve">1.3 Project Aim</w:t>
+      </w:r>
+      <w:r>
+        <w:rPr>
+          <w:rFonts w:ascii="Times New Roman" w:hAnsi="Times New Roman"/>
+          <w:sz w:val="28"/>
+        </w:rPr>
+        <w:tab/>
+      </w:r>
+      <w:r>
+        <w:rPr>
+          <w:rFonts w:ascii="Times New Roman" w:hAnsi="Times New Roman" w:cs="Times New Roman"/>
+          <w:sz w:val="28"/>
+          <w:szCs w:val="28"/>
+        </w:rPr>
+        <w:t xml:space="preserve">14</w:t>
+      </w:r>
+    </w:p>
+    <w:p>
+      <w:pPr>
+        <w:pStyle w:val="TOC2"/>
+        <w:tabs>
+          <w:tab w:val="right" w:leader="dot" w:pos="9355"/>
+        </w:tabs>
+        <w:spacing w:after="60" w:line="360" w:lineRule="auto"/>
+      </w:pPr>
+      <w:r>
+        <w:rPr>
+          <w:rFonts w:ascii="Times New Roman" w:hAnsi="Times New Roman" w:cs="Times New Roman"/>
+          <w:sz w:val="28"/>
+          <w:szCs w:val="28"/>
+        </w:rPr>
+        <w:t xml:space="preserve">1.4 Project Objectives</w:t>
+      </w:r>
+      <w:r>
+        <w:rPr>
+          <w:rFonts w:ascii="Times New Roman" w:hAnsi="Times New Roman"/>
+          <w:sz w:val="28"/>
+        </w:rPr>
+        <w:tab/>
+      </w:r>
+      <w:r>
+        <w:rPr>
+          <w:rFonts w:ascii="Times New Roman" w:hAnsi="Times New Roman" w:cs="Times New Roman"/>
+          <w:sz w:val="28"/>
+          <w:szCs w:val="28"/>
+        </w:rPr>
+        <w:t xml:space="preserve">15</w:t>
+      </w:r>
+    </w:p>
+    <w:p>
+      <w:pPr>
+        <w:pStyle w:val="TOC2"/>
+        <w:tabs>
+          <w:tab w:val="right" w:leader="dot" w:pos="9355"/>
+        </w:tabs>
+        <w:spacing w:after="60" w:line="360" w:lineRule="auto"/>
+      </w:pPr>
+      <w:r>
+        <w:rPr>
+          <w:rFonts w:ascii="Times New Roman" w:hAnsi="Times New Roman" w:cs="Times New Roman"/>
+          <w:sz w:val="28"/>
+          <w:szCs w:val="28"/>
+        </w:rPr>
+        <w:t xml:space="preserve">1.5 Research Questions and Hypotheses</w:t>
+      </w:r>
+      <w:r>
+        <w:rPr>
+          <w:rFonts w:ascii="Times New Roman" w:hAnsi="Times New Roman"/>
+          <w:sz w:val="28"/>
+        </w:rPr>
+        <w:tab/>
+      </w:r>
+      <w:r>
+        <w:rPr>
+          <w:rFonts w:ascii="Times New Roman" w:hAnsi="Times New Roman" w:cs="Times New Roman"/>
+          <w:sz w:val="28"/>
+          <w:szCs w:val="28"/>
+        </w:rPr>
+        <w:t xml:space="preserve">15</w:t>
+      </w:r>
+    </w:p>
+    <w:p>
+      <w:pPr>
+        <w:pStyle w:val="TOC2"/>
+        <w:tabs>
+          <w:tab w:val="right" w:leader="dot" w:pos="9355"/>
+        </w:tabs>
+        <w:spacing w:after="60" w:line="360" w:lineRule="auto"/>
+      </w:pPr>
+      <w:r>
+        <w:rPr>
+          <w:rFonts w:ascii="Times New Roman" w:hAnsi="Times New Roman" w:cs="Times New Roman"/>
+          <w:sz w:val="28"/>
+          <w:szCs w:val="28"/>
+        </w:rPr>
+        <w:t xml:space="preserve">1.6 Significance of the Project</w:t>
+      </w:r>
+      <w:r>
+        <w:rPr>
+          <w:rFonts w:ascii="Times New Roman" w:hAnsi="Times New Roman"/>
+          <w:sz w:val="28"/>
+        </w:rPr>
+        <w:tab/>
+      </w:r>
+      <w:r>
+        <w:rPr>
+          <w:rFonts w:ascii="Times New Roman" w:hAnsi="Times New Roman" w:cs="Times New Roman"/>
+          <w:sz w:val="28"/>
+          <w:szCs w:val="28"/>
+        </w:rPr>
+        <w:t xml:space="preserve">16</w:t>
+      </w:r>
+    </w:p>
+    <w:p>
+      <w:pPr>
+        <w:pStyle w:val="TOC2"/>
+        <w:tabs>
+          <w:tab w:val="right" w:leader="dot" w:pos="9355"/>
+        </w:tabs>
+        <w:spacing w:after="60" w:line="360" w:lineRule="auto"/>
+      </w:pPr>
+      <w:r>
+        <w:rPr>
+          <w:rFonts w:ascii="Times New Roman" w:hAnsi="Times New Roman" w:cs="Times New Roman"/>
+          <w:sz w:val="28"/>
+          <w:szCs w:val="28"/>
+        </w:rPr>
+        <w:t xml:space="preserve">1.7 Scope and Limitations</w:t>
+      </w:r>
+      <w:r>
+        <w:rPr>
+          <w:rFonts w:ascii="Times New Roman" w:hAnsi="Times New Roman"/>
+          <w:sz w:val="28"/>
+        </w:rPr>
+        <w:tab/>
+      </w:r>
+      <w:r>
+        <w:rPr>
+          <w:rFonts w:ascii="Times New Roman" w:hAnsi="Times New Roman" w:cs="Times New Roman"/>
+          <w:sz w:val="28"/>
+          <w:szCs w:val="28"/>
+        </w:rPr>
+        <w:t xml:space="preserve">16</w:t>
+      </w:r>
+    </w:p>
+    <w:p>
+      <w:pPr>
+        <w:pStyle w:val="TOC2"/>
+        <w:tabs>
+          <w:tab w:val="right" w:leader="dot" w:pos="9355"/>
+        </w:tabs>
+        <w:spacing w:after="60" w:line="360" w:lineRule="auto"/>
+      </w:pPr>
+      <w:r>
+        <w:rPr>
+          <w:rFonts w:ascii="Times New Roman" w:hAnsi="Times New Roman" w:cs="Times New Roman"/>
+          <w:sz w:val="28"/>
+          <w:szCs w:val="28"/>
+        </w:rPr>
+        <w:t xml:space="preserve">1.8 Structure of the Report</w:t>
+      </w:r>
+      <w:r>
+        <w:rPr>
+          <w:rFonts w:ascii="Times New Roman" w:hAnsi="Times New Roman"/>
+          <w:sz w:val="28"/>
+        </w:rPr>
+        <w:tab/>
+      </w:r>
+      <w:r>
+        <w:rPr>
+          <w:rFonts w:ascii="Times New Roman" w:hAnsi="Times New Roman" w:cs="Times New Roman"/>
+          <w:sz w:val="28"/>
+          <w:szCs w:val="28"/>
+        </w:rPr>
+        <w:t xml:space="preserve">17</w:t>
+      </w:r>
+    </w:p>
+    <w:p>
+      <w:pPr>
+        <w:pStyle w:val="TOC1"/>
+        <w:tabs>
+          <w:tab w:val="right" w:leader="dot" w:pos="9355"/>
+        </w:tabs>
+        <w:spacing w:after="60" w:line="360" w:lineRule="auto"/>
+      </w:pPr>
+      <w:r>
+        <w:rPr>
+          <w:rFonts w:ascii="Times New Roman" w:hAnsi="Times New Roman" w:cs="Times New Roman"/>
+          <w:b/>
+          <w:sz w:val="28"/>
+          <w:szCs w:val="28"/>
+        </w:rPr>
+        <w:t xml:space="preserve">Chapter 2 — Literature Review</w:t>
+      </w:r>
+      <w:r>
+        <w:rPr>
+          <w:rFonts w:ascii="Times New Roman" w:hAnsi="Times New Roman"/>
+          <w:sz w:val="28"/>
+        </w:rPr>
+        <w:tab/>
+      </w:r>
+      <w:r>
+        <w:rPr>
+          <w:rFonts w:ascii="Times New Roman" w:hAnsi="Times New Roman" w:cs="Times New Roman"/>
+          <w:b/>
+          <w:sz w:val="28"/>
+          <w:szCs w:val="28"/>
+        </w:rPr>
+        <w:t xml:space="preserve">18</w:t>
+      </w:r>
+    </w:p>
+    <w:p>
+      <w:pPr>
+        <w:pStyle w:val="TOC2"/>
+        <w:tabs>
+          <w:tab w:val="right" w:leader="dot" w:pos="9355"/>
+        </w:tabs>
+        <w:spacing w:after="60" w:line="360" w:lineRule="auto"/>
+      </w:pPr>
+      <w:r>
+        <w:rPr>
+          <w:rFonts w:ascii="Times New Roman" w:hAnsi="Times New Roman" w:cs="Times New Roman"/>
+          <w:sz w:val="28"/>
+          <w:szCs w:val="28"/>
+        </w:rPr>
+        <w:t xml:space="preserve">2.1 Introduction to the Literature Review</w:t>
+      </w:r>
+      <w:r>
+        <w:rPr>
+          <w:rFonts w:ascii="Times New Roman" w:hAnsi="Times New Roman"/>
+          <w:sz w:val="28"/>
+        </w:rPr>
+        <w:tab/>
+      </w:r>
+      <w:r>
+        <w:rPr>
+          <w:rFonts w:ascii="Times New Roman" w:hAnsi="Times New Roman" w:cs="Times New Roman"/>
+          <w:sz w:val="28"/>
+          <w:szCs w:val="28"/>
+        </w:rPr>
+        <w:t xml:space="preserve">18</w:t>
+      </w:r>
+    </w:p>
+    <w:p>
+      <w:pPr>
+        <w:pStyle w:val="TOC2"/>
+        <w:tabs>
+          <w:tab w:val="right" w:leader="dot" w:pos="9355"/>
+        </w:tabs>
+        <w:spacing w:after="60" w:line="360" w:lineRule="auto"/>
+      </w:pPr>
+      <w:r>
+        <w:rPr>
+          <w:rFonts w:ascii="Times New Roman" w:hAnsi="Times New Roman" w:cs="Times New Roman"/>
+          <w:sz w:val="28"/>
+          <w:szCs w:val="28"/>
+        </w:rPr>
+        <w:t xml:space="preserve">2.2 Theoretical Framework</w:t>
+      </w:r>
+      <w:r>
+        <w:rPr>
+          <w:rFonts w:ascii="Times New Roman" w:hAnsi="Times New Roman"/>
+          <w:sz w:val="28"/>
+        </w:rPr>
+        <w:tab/>
+      </w:r>
+      <w:r>
+        <w:rPr>
+          <w:rFonts w:ascii="Times New Roman" w:hAnsi="Times New Roman" w:cs="Times New Roman"/>
+          <w:sz w:val="28"/>
+          <w:szCs w:val="28"/>
+        </w:rPr>
+        <w:t xml:space="preserve">18</w:t>
+      </w:r>
+    </w:p>
+    <w:p>
+      <w:pPr>
+        <w:pStyle w:val="TOC2"/>
+        <w:tabs>
+          <w:tab w:val="right" w:leader="dot" w:pos="9355"/>
+        </w:tabs>
+        <w:spacing w:after="60" w:line="360" w:lineRule="auto"/>
+      </w:pPr>
+      <w:r>
+        <w:rPr>
+          <w:rFonts w:ascii="Times New Roman" w:hAnsi="Times New Roman" w:cs="Times New Roman"/>
+          <w:sz w:val="28"/>
+          <w:szCs w:val="28"/>
+        </w:rPr>
+        <w:t xml:space="preserve">2.3 Thematic Review</w:t>
+      </w:r>
+      <w:r>
+        <w:rPr>
+          <w:rFonts w:ascii="Times New Roman" w:hAnsi="Times New Roman"/>
+          <w:sz w:val="28"/>
+        </w:rPr>
+        <w:tab/>
+      </w:r>
+      <w:r>
+        <w:rPr>
+          <w:rFonts w:ascii="Times New Roman" w:hAnsi="Times New Roman" w:cs="Times New Roman"/>
+          <w:sz w:val="28"/>
+          <w:szCs w:val="28"/>
+        </w:rPr>
+        <w:t xml:space="preserve">19</w:t>
+      </w:r>
+    </w:p>
+    <w:p>
+      <w:pPr>
+        <w:pStyle w:val="TOC3"/>
+        <w:tabs>
+          <w:tab w:val="right" w:leader="dot" w:pos="9355"/>
+        </w:tabs>
+        <w:spacing w:after="60" w:line="360" w:lineRule="auto"/>
+      </w:pPr>
+      <w:r>
+        <w:rPr>
+          <w:rFonts w:ascii="Times New Roman" w:hAnsi="Times New Roman" w:cs="Times New Roman"/>
+          <w:sz w:val="28"/>
+          <w:szCs w:val="28"/>
+        </w:rPr>
+        <w:t xml:space="preserve">2.3.1 Theme 1 — Defining and Characterising Fake News</w:t>
+      </w:r>
+      <w:r>
+        <w:rPr>
+          <w:rFonts w:ascii="Times New Roman" w:hAnsi="Times New Roman"/>
+          <w:sz w:val="28"/>
+        </w:rPr>
+        <w:tab/>
+      </w:r>
+      <w:r>
+        <w:rPr>
+          <w:rFonts w:ascii="Times New Roman" w:hAnsi="Times New Roman" w:cs="Times New Roman"/>
+          <w:sz w:val="28"/>
+          <w:szCs w:val="28"/>
+        </w:rPr>
+        <w:t xml:space="preserve">19</w:t>
+      </w:r>
+    </w:p>
+    <w:p>
+      <w:pPr>
+        <w:pStyle w:val="TOC3"/>
+        <w:tabs>
+          <w:tab w:val="right" w:leader="dot" w:pos="9355"/>
+        </w:tabs>
+        <w:spacing w:after="60" w:line="360" w:lineRule="auto"/>
+      </w:pPr>
+      <w:r>
+        <w:rPr>
+          <w:rFonts w:ascii="Times New Roman" w:hAnsi="Times New Roman" w:cs="Times New Roman"/>
+          <w:sz w:val="28"/>
+          <w:szCs w:val="28"/>
+        </w:rPr>
+        <w:t xml:space="preserve">2.3.2 Theme 2 — Classical Machine Learning for Text and Fake-News Detection</w:t>
+      </w:r>
+      <w:r>
+        <w:rPr>
+          <w:rFonts w:ascii="Times New Roman" w:hAnsi="Times New Roman"/>
+          <w:sz w:val="28"/>
+        </w:rPr>
+        <w:tab/>
+      </w:r>
+      <w:r>
+        <w:rPr>
+          <w:rFonts w:ascii="Times New Roman" w:hAnsi="Times New Roman" w:cs="Times New Roman"/>
+          <w:sz w:val="28"/>
+          <w:szCs w:val="28"/>
+        </w:rPr>
+        <w:t xml:space="preserve">20</w:t>
+      </w:r>
+    </w:p>
+    <w:p>
+      <w:pPr>
+        <w:pStyle w:val="TOC3"/>
+        <w:tabs>
+          <w:tab w:val="right" w:leader="dot" w:pos="9355"/>
+        </w:tabs>
+        <w:spacing w:after="60" w:line="360" w:lineRule="auto"/>
+      </w:pPr>
+      <w:r>
+        <w:rPr>
+          <w:rFonts w:ascii="Times New Roman" w:hAnsi="Times New Roman" w:cs="Times New Roman"/>
+          <w:sz w:val="28"/>
+          <w:szCs w:val="28"/>
+        </w:rPr>
+        <w:t xml:space="preserve">2.3.3 Theme 3 — NLP for Low-Resource and Morphologically Rich Languages</w:t>
+      </w:r>
+      <w:r>
+        <w:rPr>
+          <w:rFonts w:ascii="Times New Roman" w:hAnsi="Times New Roman"/>
+          <w:sz w:val="28"/>
+        </w:rPr>
+        <w:tab/>
+      </w:r>
+      <w:r>
+        <w:rPr>
+          <w:rFonts w:ascii="Times New Roman" w:hAnsi="Times New Roman" w:cs="Times New Roman"/>
+          <w:sz w:val="28"/>
+          <w:szCs w:val="28"/>
+        </w:rPr>
+        <w:t xml:space="preserve">20</w:t>
+      </w:r>
+    </w:p>
+    <w:p>
+      <w:pPr>
+        <w:pStyle w:val="TOC2"/>
+        <w:tabs>
+          <w:tab w:val="right" w:leader="dot" w:pos="9355"/>
+        </w:tabs>
+        <w:spacing w:after="60" w:line="360" w:lineRule="auto"/>
+      </w:pPr>
+      <w:r>
+        <w:rPr>
+          <w:rFonts w:ascii="Times New Roman" w:hAnsi="Times New Roman" w:cs="Times New Roman"/>
+          <w:sz w:val="28"/>
+          <w:szCs w:val="28"/>
+        </w:rPr>
+        <w:t xml:space="preserve">2.4 Industry and Practice Review</w:t>
+      </w:r>
+      <w:r>
+        <w:rPr>
+          <w:rFonts w:ascii="Times New Roman" w:hAnsi="Times New Roman"/>
+          <w:sz w:val="28"/>
+        </w:rPr>
+        <w:tab/>
+      </w:r>
+      <w:r>
+        <w:rPr>
+          <w:rFonts w:ascii="Times New Roman" w:hAnsi="Times New Roman" w:cs="Times New Roman"/>
+          <w:sz w:val="28"/>
+          <w:szCs w:val="28"/>
+        </w:rPr>
+        <w:t xml:space="preserve">21</w:t>
+      </w:r>
+    </w:p>
+    <w:p>
+      <w:pPr>
+        <w:pStyle w:val="TOC2"/>
+        <w:tabs>
+          <w:tab w:val="right" w:leader="dot" w:pos="9355"/>
+        </w:tabs>
+        <w:spacing w:after="60" w:line="360" w:lineRule="auto"/>
+      </w:pPr>
+      <w:r>
+        <w:rPr>
+          <w:rFonts w:ascii="Times New Roman" w:hAnsi="Times New Roman" w:cs="Times New Roman"/>
+          <w:sz w:val="28"/>
+          <w:szCs w:val="28"/>
+        </w:rPr>
+        <w:t xml:space="preserve">2.5 Identification of the Gap</w:t>
+      </w:r>
+      <w:r>
+        <w:rPr>
+          <w:rFonts w:ascii="Times New Roman" w:hAnsi="Times New Roman"/>
+          <w:sz w:val="28"/>
+        </w:rPr>
+        <w:tab/>
+      </w:r>
+      <w:r>
+        <w:rPr>
+          <w:rFonts w:ascii="Times New Roman" w:hAnsi="Times New Roman" w:cs="Times New Roman"/>
+          <w:sz w:val="28"/>
+          <w:szCs w:val="28"/>
+        </w:rPr>
+        <w:t xml:space="preserve">21</w:t>
+      </w:r>
+    </w:p>
+    <w:p>
+      <w:pPr>
+        <w:pStyle w:val="TOC2"/>
+        <w:tabs>
+          <w:tab w:val="right" w:leader="dot" w:pos="9355"/>
+        </w:tabs>
+        <w:spacing w:after="60" w:line="360" w:lineRule="auto"/>
+      </w:pPr>
+      <w:r>
+        <w:rPr>
+          <w:rFonts w:ascii="Times New Roman" w:hAnsi="Times New Roman" w:cs="Times New Roman"/>
+          <w:sz w:val="28"/>
+          <w:szCs w:val="28"/>
+        </w:rPr>
+        <w:t xml:space="preserve">2.6 Conceptual Framework</w:t>
+      </w:r>
+      <w:r>
+        <w:rPr>
+          <w:rFonts w:ascii="Times New Roman" w:hAnsi="Times New Roman"/>
+          <w:sz w:val="28"/>
+        </w:rPr>
+        <w:tab/>
+      </w:r>
+      <w:r>
+        <w:rPr>
+          <w:rFonts w:ascii="Times New Roman" w:hAnsi="Times New Roman" w:cs="Times New Roman"/>
+          <w:sz w:val="28"/>
+          <w:szCs w:val="28"/>
+        </w:rPr>
+        <w:t xml:space="preserve">21</w:t>
+      </w:r>
+    </w:p>
+    <w:p>
+      <w:pPr>
+        <w:pStyle w:val="TOC2"/>
+        <w:tabs>
+          <w:tab w:val="right" w:leader="dot" w:pos="9355"/>
+        </w:tabs>
+        <w:spacing w:after="60" w:line="360" w:lineRule="auto"/>
+      </w:pPr>
+      <w:r>
+        <w:rPr>
+          <w:rFonts w:ascii="Times New Roman" w:hAnsi="Times New Roman" w:cs="Times New Roman"/>
+          <w:sz w:val="28"/>
+          <w:szCs w:val="28"/>
+        </w:rPr>
+        <w:t xml:space="preserve">2.7 Summary of the Literature Review</w:t>
+      </w:r>
+      <w:r>
+        <w:rPr>
+          <w:rFonts w:ascii="Times New Roman" w:hAnsi="Times New Roman"/>
+          <w:sz w:val="28"/>
+        </w:rPr>
+        <w:tab/>
+      </w:r>
+      <w:r>
+        <w:rPr>
+          <w:rFonts w:ascii="Times New Roman" w:hAnsi="Times New Roman" w:cs="Times New Roman"/>
+          <w:sz w:val="28"/>
+          <w:szCs w:val="28"/>
+        </w:rPr>
+        <w:t xml:space="preserve">22</w:t>
+      </w:r>
+    </w:p>
+    <w:p>
+      <w:pPr>
+        <w:pStyle w:val="TOC1"/>
+        <w:tabs>
+          <w:tab w:val="right" w:leader="dot" w:pos="9355"/>
+        </w:tabs>
+        <w:spacing w:after="60" w:line="360" w:lineRule="auto"/>
+      </w:pPr>
+      <w:r>
+        <w:rPr>
+          <w:rFonts w:ascii="Times New Roman" w:hAnsi="Times New Roman" w:cs="Times New Roman"/>
+          <w:b/>
+          <w:sz w:val="28"/>
+          <w:szCs w:val="28"/>
+        </w:rPr>
+        <w:t xml:space="preserve">Chapter 3 — Project Planning and Methodology</w:t>
+      </w:r>
+      <w:r>
+        <w:rPr>
+          <w:rFonts w:ascii="Times New Roman" w:hAnsi="Times New Roman"/>
+          <w:sz w:val="28"/>
+        </w:rPr>
+        <w:tab/>
+      </w:r>
+      <w:r>
+        <w:rPr>
+          <w:rFonts w:ascii="Times New Roman" w:hAnsi="Times New Roman" w:cs="Times New Roman"/>
+          <w:b/>
+          <w:sz w:val="28"/>
+          <w:szCs w:val="28"/>
+        </w:rPr>
+        <w:t xml:space="preserve">23</w:t>
+      </w:r>
+    </w:p>
+    <w:p>
+      <w:pPr>
+        <w:pStyle w:val="TOC2"/>
+        <w:tabs>
+          <w:tab w:val="right" w:leader="dot" w:pos="9355"/>
+        </w:tabs>
+        <w:spacing w:after="60" w:line="360" w:lineRule="auto"/>
+      </w:pPr>
+      <w:r>
+        <w:rPr>
+          <w:rFonts w:ascii="Times New Roman" w:hAnsi="Times New Roman" w:cs="Times New Roman"/>
+          <w:sz w:val="28"/>
+          <w:szCs w:val="28"/>
+        </w:rPr>
+        <w:t xml:space="preserve">3.1 Research Philosophy and Approach</w:t>
+      </w:r>
+      <w:r>
+        <w:rPr>
+          <w:rFonts w:ascii="Times New Roman" w:hAnsi="Times New Roman"/>
+          <w:sz w:val="28"/>
+        </w:rPr>
+        <w:tab/>
+      </w:r>
+      <w:r>
+        <w:rPr>
+          <w:rFonts w:ascii="Times New Roman" w:hAnsi="Times New Roman" w:cs="Times New Roman"/>
+          <w:sz w:val="28"/>
+          <w:szCs w:val="28"/>
+        </w:rPr>
+        <w:t xml:space="preserve">23</w:t>
+      </w:r>
+    </w:p>
+    <w:p>
+      <w:pPr>
+        <w:pStyle w:val="TOC2"/>
+        <w:tabs>
+          <w:tab w:val="right" w:leader="dot" w:pos="9355"/>
+        </w:tabs>
+        <w:spacing w:after="60" w:line="360" w:lineRule="auto"/>
+      </w:pPr>
+      <w:r>
+        <w:rPr>
+          <w:rFonts w:ascii="Times New Roman" w:hAnsi="Times New Roman" w:cs="Times New Roman"/>
+          <w:sz w:val="28"/>
+          <w:szCs w:val="28"/>
+        </w:rPr>
+        <w:t xml:space="preserve">3.2 Methodological Choice</w:t>
+      </w:r>
+      <w:r>
+        <w:rPr>
+          <w:rFonts w:ascii="Times New Roman" w:hAnsi="Times New Roman"/>
+          <w:sz w:val="28"/>
+        </w:rPr>
+        <w:tab/>
+      </w:r>
+      <w:r>
+        <w:rPr>
+          <w:rFonts w:ascii="Times New Roman" w:hAnsi="Times New Roman" w:cs="Times New Roman"/>
+          <w:sz w:val="28"/>
+          <w:szCs w:val="28"/>
+        </w:rPr>
+        <w:t xml:space="preserve">23</w:t>
+      </w:r>
+    </w:p>
+    <w:p>
+      <w:pPr>
+        <w:pStyle w:val="TOC2"/>
+        <w:tabs>
+          <w:tab w:val="right" w:leader="dot" w:pos="9355"/>
+        </w:tabs>
+        <w:spacing w:after="60" w:line="360" w:lineRule="auto"/>
+      </w:pPr>
+      <w:r>
+        <w:rPr>
+          <w:rFonts w:ascii="Times New Roman" w:hAnsi="Times New Roman" w:cs="Times New Roman"/>
+          <w:sz w:val="28"/>
+          <w:szCs w:val="28"/>
+        </w:rPr>
+        <w:t xml:space="preserve">3.3 Project Management Methodology</w:t>
+      </w:r>
+      <w:r>
+        <w:rPr>
+          <w:rFonts w:ascii="Times New Roman" w:hAnsi="Times New Roman"/>
+          <w:sz w:val="28"/>
+        </w:rPr>
+        <w:tab/>
+      </w:r>
+      <w:r>
+        <w:rPr>
+          <w:rFonts w:ascii="Times New Roman" w:hAnsi="Times New Roman" w:cs="Times New Roman"/>
+          <w:sz w:val="28"/>
+          <w:szCs w:val="28"/>
+        </w:rPr>
+        <w:t xml:space="preserve">23</w:t>
+      </w:r>
+    </w:p>
+    <w:p>
+      <w:pPr>
+        <w:pStyle w:val="TOC2"/>
+        <w:tabs>
+          <w:tab w:val="right" w:leader="dot" w:pos="9355"/>
+        </w:tabs>
+        <w:spacing w:after="60" w:line="360" w:lineRule="auto"/>
+      </w:pPr>
+      <w:r>
+        <w:rPr>
+          <w:rFonts w:ascii="Times New Roman" w:hAnsi="Times New Roman" w:cs="Times New Roman"/>
+          <w:sz w:val="28"/>
+          <w:szCs w:val="28"/>
+        </w:rPr>
+        <w:t xml:space="preserve">3.4 Project Plan</w:t>
+      </w:r>
+      <w:r>
+        <w:rPr>
+          <w:rFonts w:ascii="Times New Roman" w:hAnsi="Times New Roman"/>
+          <w:sz w:val="28"/>
+        </w:rPr>
+        <w:tab/>
+      </w:r>
+      <w:r>
+        <w:rPr>
+          <w:rFonts w:ascii="Times New Roman" w:hAnsi="Times New Roman" w:cs="Times New Roman"/>
+          <w:sz w:val="28"/>
+          <w:szCs w:val="28"/>
+        </w:rPr>
+        <w:t xml:space="preserve">24</w:t>
+      </w:r>
+    </w:p>
+    <w:p>
+      <w:pPr>
+        <w:pStyle w:val="TOC3"/>
+        <w:tabs>
+          <w:tab w:val="right" w:leader="dot" w:pos="9355"/>
+        </w:tabs>
+        <w:spacing w:after="60" w:line="360" w:lineRule="auto"/>
+      </w:pPr>
+      <w:r>
+        <w:rPr>
+          <w:rFonts w:ascii="Times New Roman" w:hAnsi="Times New Roman" w:cs="Times New Roman"/>
+          <w:sz w:val="28"/>
+          <w:szCs w:val="28"/>
+        </w:rPr>
+        <w:t xml:space="preserve">3.4.1 Work Breakdown Structure (WBS)</w:t>
+      </w:r>
+      <w:r>
+        <w:rPr>
+          <w:rFonts w:ascii="Times New Roman" w:hAnsi="Times New Roman"/>
+          <w:sz w:val="28"/>
+        </w:rPr>
+        <w:tab/>
+      </w:r>
+      <w:r>
+        <w:rPr>
+          <w:rFonts w:ascii="Times New Roman" w:hAnsi="Times New Roman" w:cs="Times New Roman"/>
+          <w:sz w:val="28"/>
+          <w:szCs w:val="28"/>
+        </w:rPr>
+        <w:t xml:space="preserve">24</w:t>
+      </w:r>
+    </w:p>
+    <w:p>
+      <w:pPr>
+        <w:pStyle w:val="TOC3"/>
+        <w:tabs>
+          <w:tab w:val="right" w:leader="dot" w:pos="9355"/>
+        </w:tabs>
+        <w:spacing w:after="60" w:line="360" w:lineRule="auto"/>
+      </w:pPr>
+      <w:r>
+        <w:rPr>
+          <w:rFonts w:ascii="Times New Roman" w:hAnsi="Times New Roman" w:cs="Times New Roman"/>
+          <w:sz w:val="28"/>
+          <w:szCs w:val="28"/>
+        </w:rPr>
+        <w:t xml:space="preserve">3.4.2 Gantt Chart and Timeline</w:t>
+      </w:r>
+      <w:r>
+        <w:rPr>
+          <w:rFonts w:ascii="Times New Roman" w:hAnsi="Times New Roman"/>
+          <w:sz w:val="28"/>
+        </w:rPr>
+        <w:tab/>
+      </w:r>
+      <w:r>
+        <w:rPr>
+          <w:rFonts w:ascii="Times New Roman" w:hAnsi="Times New Roman" w:cs="Times New Roman"/>
+          <w:sz w:val="28"/>
+          <w:szCs w:val="28"/>
+        </w:rPr>
+        <w:t xml:space="preserve">24</w:t>
+      </w:r>
+    </w:p>
+    <w:p>
+      <w:pPr>
+        <w:pStyle w:val="TOC3"/>
+        <w:tabs>
+          <w:tab w:val="right" w:leader="dot" w:pos="9355"/>
+        </w:tabs>
+        <w:spacing w:after="60" w:line="360" w:lineRule="auto"/>
+      </w:pPr>
+      <w:r>
+        <w:rPr>
+          <w:rFonts w:ascii="Times New Roman" w:hAnsi="Times New Roman" w:cs="Times New Roman"/>
+          <w:sz w:val="28"/>
+          <w:szCs w:val="28"/>
+        </w:rPr>
+        <w:t xml:space="preserve">3.4.3 Milestones and Critical Path</w:t>
+      </w:r>
+      <w:r>
+        <w:rPr>
+          <w:rFonts w:ascii="Times New Roman" w:hAnsi="Times New Roman"/>
+          <w:sz w:val="28"/>
+        </w:rPr>
+        <w:tab/>
+      </w:r>
+      <w:r>
+        <w:rPr>
+          <w:rFonts w:ascii="Times New Roman" w:hAnsi="Times New Roman" w:cs="Times New Roman"/>
+          <w:sz w:val="28"/>
+          <w:szCs w:val="28"/>
+        </w:rPr>
+        <w:t xml:space="preserve">25</w:t>
+      </w:r>
+    </w:p>
+    <w:p>
+      <w:pPr>
+        <w:pStyle w:val="TOC2"/>
+        <w:tabs>
+          <w:tab w:val="right" w:leader="dot" w:pos="9355"/>
+        </w:tabs>
+        <w:spacing w:after="60" w:line="360" w:lineRule="auto"/>
+      </w:pPr>
+      <w:r>
+        <w:rPr>
+          <w:rFonts w:ascii="Times New Roman" w:hAnsi="Times New Roman" w:cs="Times New Roman"/>
+          <w:sz w:val="28"/>
+          <w:szCs w:val="28"/>
+        </w:rPr>
+        <w:t xml:space="preserve">3.5 Resource Planning</w:t>
+      </w:r>
+      <w:r>
+        <w:rPr>
+          <w:rFonts w:ascii="Times New Roman" w:hAnsi="Times New Roman"/>
+          <w:sz w:val="28"/>
+        </w:rPr>
+        <w:tab/>
+      </w:r>
+      <w:r>
+        <w:rPr>
+          <w:rFonts w:ascii="Times New Roman" w:hAnsi="Times New Roman" w:cs="Times New Roman"/>
+          <w:sz w:val="28"/>
+          <w:szCs w:val="28"/>
+        </w:rPr>
+        <w:t xml:space="preserve">25</w:t>
+      </w:r>
+    </w:p>
+    <w:p>
+      <w:pPr>
+        <w:pStyle w:val="TOC2"/>
+        <w:tabs>
+          <w:tab w:val="right" w:leader="dot" w:pos="9355"/>
+        </w:tabs>
+        <w:spacing w:after="60" w:line="360" w:lineRule="auto"/>
+      </w:pPr>
+      <w:r>
+        <w:rPr>
+          <w:rFonts w:ascii="Times New Roman" w:hAnsi="Times New Roman" w:cs="Times New Roman"/>
+          <w:sz w:val="28"/>
+          <w:szCs w:val="28"/>
+        </w:rPr>
+        <w:t xml:space="preserve">3.6 Risk Register</w:t>
+      </w:r>
+      <w:r>
+        <w:rPr>
+          <w:rFonts w:ascii="Times New Roman" w:hAnsi="Times New Roman"/>
+          <w:sz w:val="28"/>
+        </w:rPr>
+        <w:tab/>
+      </w:r>
+      <w:r>
+        <w:rPr>
+          <w:rFonts w:ascii="Times New Roman" w:hAnsi="Times New Roman" w:cs="Times New Roman"/>
+          <w:sz w:val="28"/>
+          <w:szCs w:val="28"/>
+        </w:rPr>
+        <w:t xml:space="preserve">26</w:t>
+      </w:r>
+    </w:p>
+    <w:p>
+      <w:pPr>
+        <w:pStyle w:val="TOC2"/>
+        <w:tabs>
+          <w:tab w:val="right" w:leader="dot" w:pos="9355"/>
+        </w:tabs>
+        <w:spacing w:after="60" w:line="360" w:lineRule="auto"/>
+      </w:pPr>
+      <w:r>
+        <w:rPr>
+          <w:rFonts w:ascii="Times New Roman" w:hAnsi="Times New Roman" w:cs="Times New Roman"/>
+          <w:sz w:val="28"/>
+          <w:szCs w:val="28"/>
+        </w:rPr>
+        <w:t xml:space="preserve">3.7 Ethical Considerations</w:t>
+      </w:r>
+      <w:r>
+        <w:rPr>
+          <w:rFonts w:ascii="Times New Roman" w:hAnsi="Times New Roman"/>
+          <w:sz w:val="28"/>
+        </w:rPr>
+        <w:tab/>
+      </w:r>
+      <w:r>
+        <w:rPr>
+          <w:rFonts w:ascii="Times New Roman" w:hAnsi="Times New Roman" w:cs="Times New Roman"/>
+          <w:sz w:val="28"/>
+          <w:szCs w:val="28"/>
+        </w:rPr>
+        <w:t xml:space="preserve">26</w:t>
+      </w:r>
+    </w:p>
+    <w:p>
+      <w:pPr>
+        <w:pStyle w:val="TOC2"/>
+        <w:tabs>
+          <w:tab w:val="right" w:leader="dot" w:pos="9355"/>
+        </w:tabs>
+        <w:spacing w:after="60" w:line="360" w:lineRule="auto"/>
+      </w:pPr>
+      <w:r>
+        <w:rPr>
+          <w:rFonts w:ascii="Times New Roman" w:hAnsi="Times New Roman" w:cs="Times New Roman"/>
+          <w:sz w:val="28"/>
+          <w:szCs w:val="28"/>
+        </w:rPr>
+        <w:t xml:space="preserve">3.8 Project Tracking and Documentation</w:t>
+      </w:r>
+      <w:r>
+        <w:rPr>
+          <w:rFonts w:ascii="Times New Roman" w:hAnsi="Times New Roman"/>
+          <w:sz w:val="28"/>
+        </w:rPr>
+        <w:tab/>
+      </w:r>
+      <w:r>
+        <w:rPr>
+          <w:rFonts w:ascii="Times New Roman" w:hAnsi="Times New Roman" w:cs="Times New Roman"/>
+          <w:sz w:val="28"/>
+          <w:szCs w:val="28"/>
+        </w:rPr>
+        <w:t xml:space="preserve">27</w:t>
+      </w:r>
+    </w:p>
+    <w:p>
+      <w:pPr>
+        <w:pStyle w:val="TOC2"/>
+        <w:tabs>
+          <w:tab w:val="right" w:leader="dot" w:pos="9355"/>
+        </w:tabs>
+        <w:spacing w:after="60" w:line="360" w:lineRule="auto"/>
+      </w:pPr>
+      <w:r>
+        <w:rPr>
+          <w:rFonts w:ascii="Times New Roman" w:hAnsi="Times New Roman" w:cs="Times New Roman"/>
+          <w:sz w:val="28"/>
+          <w:szCs w:val="28"/>
+        </w:rPr>
+        <w:t xml:space="preserve">3.9 Implementation of the Plan</w:t>
+      </w:r>
+      <w:r>
+        <w:rPr>
+          <w:rFonts w:ascii="Times New Roman" w:hAnsi="Times New Roman"/>
+          <w:sz w:val="28"/>
+        </w:rPr>
+        <w:tab/>
+      </w:r>
+      <w:r>
+        <w:rPr>
+          <w:rFonts w:ascii="Times New Roman" w:hAnsi="Times New Roman" w:cs="Times New Roman"/>
+          <w:sz w:val="28"/>
+          <w:szCs w:val="28"/>
+        </w:rPr>
+        <w:t xml:space="preserve">27</w:t>
+      </w:r>
+    </w:p>
+    <w:p>
+      <w:pPr>
+        <w:pStyle w:val="TOC2"/>
+        <w:tabs>
+          <w:tab w:val="right" w:leader="dot" w:pos="9355"/>
+        </w:tabs>
+        <w:spacing w:after="60" w:line="360" w:lineRule="auto"/>
+      </w:pPr>
+      <w:r>
+        <w:rPr>
+          <w:rFonts w:ascii="Times New Roman" w:hAnsi="Times New Roman" w:cs="Times New Roman"/>
+          <w:sz w:val="28"/>
+          <w:szCs w:val="28"/>
+        </w:rPr>
+        <w:t xml:space="preserve">3.10 Critical Assessment of Project Management</w:t>
+      </w:r>
+      <w:r>
+        <w:rPr>
+          <w:rFonts w:ascii="Times New Roman" w:hAnsi="Times New Roman"/>
+          <w:sz w:val="28"/>
+        </w:rPr>
+        <w:tab/>
+      </w:r>
+      <w:r>
+        <w:rPr>
+          <w:rFonts w:ascii="Times New Roman" w:hAnsi="Times New Roman" w:cs="Times New Roman"/>
+          <w:sz w:val="28"/>
+          <w:szCs w:val="28"/>
+        </w:rPr>
+        <w:t xml:space="preserve">27</w:t>
+      </w:r>
+    </w:p>
+    <w:p>
+      <w:pPr>
+        <w:pStyle w:val="TOC1"/>
+        <w:tabs>
+          <w:tab w:val="right" w:leader="dot" w:pos="9355"/>
+        </w:tabs>
+        <w:spacing w:after="60" w:line="360" w:lineRule="auto"/>
+      </w:pPr>
+      <w:r>
+        <w:rPr>
+          <w:rFonts w:ascii="Times New Roman" w:hAnsi="Times New Roman" w:cs="Times New Roman"/>
+          <w:b/>
+          <w:sz w:val="28"/>
+          <w:szCs w:val="28"/>
+        </w:rPr>
+        <w:t xml:space="preserve">Chapter 4 — Data Collection and Analysis</w:t>
+      </w:r>
+      <w:r>
+        <w:rPr>
+          <w:rFonts w:ascii="Times New Roman" w:hAnsi="Times New Roman"/>
+          <w:sz w:val="28"/>
+        </w:rPr>
+        <w:tab/>
+      </w:r>
+      <w:r>
+        <w:rPr>
+          <w:rFonts w:ascii="Times New Roman" w:hAnsi="Times New Roman" w:cs="Times New Roman"/>
+          <w:b/>
+          <w:sz w:val="28"/>
+          <w:szCs w:val="28"/>
+        </w:rPr>
+        <w:t xml:space="preserve">28</w:t>
+      </w:r>
+    </w:p>
+    <w:p>
+      <w:pPr>
+        <w:pStyle w:val="TOC2"/>
+        <w:tabs>
+          <w:tab w:val="right" w:leader="dot" w:pos="9355"/>
+        </w:tabs>
+        <w:spacing w:after="60" w:line="360" w:lineRule="auto"/>
+      </w:pPr>
+      <w:r>
+        <w:rPr>
+          <w:rFonts w:ascii="Times New Roman" w:hAnsi="Times New Roman" w:cs="Times New Roman"/>
+          <w:sz w:val="28"/>
+          <w:szCs w:val="28"/>
+        </w:rPr>
+        <w:t xml:space="preserve">4.1 Data Collection Methods</w:t>
+      </w:r>
+      <w:r>
+        <w:rPr>
+          <w:rFonts w:ascii="Times New Roman" w:hAnsi="Times New Roman"/>
+          <w:sz w:val="28"/>
+        </w:rPr>
+        <w:tab/>
+      </w:r>
+      <w:r>
+        <w:rPr>
+          <w:rFonts w:ascii="Times New Roman" w:hAnsi="Times New Roman" w:cs="Times New Roman"/>
+          <w:sz w:val="28"/>
+          <w:szCs w:val="28"/>
+        </w:rPr>
+        <w:t xml:space="preserve">28</w:t>
+      </w:r>
+    </w:p>
+    <w:p>
+      <w:pPr>
+        <w:pStyle w:val="TOC3"/>
+        <w:tabs>
+          <w:tab w:val="right" w:leader="dot" w:pos="9355"/>
+        </w:tabs>
+        <w:spacing w:after="60" w:line="360" w:lineRule="auto"/>
+      </w:pPr>
+      <w:r>
+        <w:rPr>
+          <w:rFonts w:ascii="Times New Roman" w:hAnsi="Times New Roman" w:cs="Times New Roman"/>
+          <w:sz w:val="28"/>
+          <w:szCs w:val="28"/>
+        </w:rPr>
+        <w:t xml:space="preserve">4.1.1 Primary and Secondary Data</w:t>
+      </w:r>
+      <w:r>
+        <w:rPr>
+          <w:rFonts w:ascii="Times New Roman" w:hAnsi="Times New Roman"/>
+          <w:sz w:val="28"/>
+        </w:rPr>
+        <w:tab/>
+      </w:r>
+      <w:r>
+        <w:rPr>
+          <w:rFonts w:ascii="Times New Roman" w:hAnsi="Times New Roman" w:cs="Times New Roman"/>
+          <w:sz w:val="28"/>
+          <w:szCs w:val="28"/>
+        </w:rPr>
+        <w:t xml:space="preserve">28</w:t>
+      </w:r>
+    </w:p>
+    <w:p>
+      <w:pPr>
+        <w:pStyle w:val="TOC3"/>
+        <w:tabs>
+          <w:tab w:val="right" w:leader="dot" w:pos="9355"/>
+        </w:tabs>
+        <w:spacing w:after="60" w:line="360" w:lineRule="auto"/>
+      </w:pPr>
+      <w:r>
+        <w:rPr>
+          <w:rFonts w:ascii="Times New Roman" w:hAnsi="Times New Roman" w:cs="Times New Roman"/>
+          <w:sz w:val="28"/>
+          <w:szCs w:val="28"/>
+        </w:rPr>
+        <w:t xml:space="preserve">4.1.2 Sampling Strategy</w:t>
+      </w:r>
+      <w:r>
+        <w:rPr>
+          <w:rFonts w:ascii="Times New Roman" w:hAnsi="Times New Roman"/>
+          <w:sz w:val="28"/>
+        </w:rPr>
+        <w:tab/>
+      </w:r>
+      <w:r>
+        <w:rPr>
+          <w:rFonts w:ascii="Times New Roman" w:hAnsi="Times New Roman" w:cs="Times New Roman"/>
+          <w:sz w:val="28"/>
+          <w:szCs w:val="28"/>
+        </w:rPr>
+        <w:t xml:space="preserve">29</w:t>
+      </w:r>
+    </w:p>
+    <w:p>
+      <w:pPr>
+        <w:pStyle w:val="TOC3"/>
+        <w:tabs>
+          <w:tab w:val="right" w:leader="dot" w:pos="9355"/>
+        </w:tabs>
+        <w:spacing w:after="60" w:line="360" w:lineRule="auto"/>
+      </w:pPr>
+      <w:r>
+        <w:rPr>
+          <w:rFonts w:ascii="Times New Roman" w:hAnsi="Times New Roman" w:cs="Times New Roman"/>
+          <w:sz w:val="28"/>
+          <w:szCs w:val="28"/>
+        </w:rPr>
+        <w:t xml:space="preserve">4.1.3 Preprocessing</w:t>
+      </w:r>
+      <w:r>
+        <w:rPr>
+          <w:rFonts w:ascii="Times New Roman" w:hAnsi="Times New Roman"/>
+          <w:sz w:val="28"/>
+        </w:rPr>
+        <w:tab/>
+      </w:r>
+      <w:r>
+        <w:rPr>
+          <w:rFonts w:ascii="Times New Roman" w:hAnsi="Times New Roman" w:cs="Times New Roman"/>
+          <w:sz w:val="28"/>
+          <w:szCs w:val="28"/>
+        </w:rPr>
+        <w:t xml:space="preserve">29</w:t>
+      </w:r>
+    </w:p>
+    <w:p>
+      <w:pPr>
+        <w:pStyle w:val="TOC3"/>
+        <w:tabs>
+          <w:tab w:val="right" w:leader="dot" w:pos="9355"/>
+        </w:tabs>
+        <w:spacing w:after="60" w:line="360" w:lineRule="auto"/>
+      </w:pPr>
+      <w:r>
+        <w:rPr>
+          <w:rFonts w:ascii="Times New Roman" w:hAnsi="Times New Roman" w:cs="Times New Roman"/>
+          <w:sz w:val="28"/>
+          <w:szCs w:val="28"/>
+        </w:rPr>
+        <w:t xml:space="preserve">4.1.4 Feature Representation</w:t>
+      </w:r>
+      <w:r>
+        <w:rPr>
+          <w:rFonts w:ascii="Times New Roman" w:hAnsi="Times New Roman"/>
+          <w:sz w:val="28"/>
+        </w:rPr>
+        <w:tab/>
+      </w:r>
+      <w:r>
+        <w:rPr>
+          <w:rFonts w:ascii="Times New Roman" w:hAnsi="Times New Roman" w:cs="Times New Roman"/>
+          <w:sz w:val="28"/>
+          <w:szCs w:val="28"/>
+        </w:rPr>
+        <w:t xml:space="preserve">29</w:t>
+      </w:r>
+    </w:p>
+    <w:p>
+      <w:pPr>
+        <w:pStyle w:val="TOC2"/>
+        <w:tabs>
+          <w:tab w:val="right" w:leader="dot" w:pos="9355"/>
+        </w:tabs>
+        <w:spacing w:after="60" w:line="360" w:lineRule="auto"/>
+      </w:pPr>
+      <w:r>
+        <w:rPr>
+          <w:rFonts w:ascii="Times New Roman" w:hAnsi="Times New Roman" w:cs="Times New Roman"/>
+          <w:sz w:val="28"/>
+          <w:szCs w:val="28"/>
+        </w:rPr>
+        <w:t xml:space="preserve">4.2 Analytical Techniques</w:t>
+      </w:r>
+      <w:r>
+        <w:rPr>
+          <w:rFonts w:ascii="Times New Roman" w:hAnsi="Times New Roman"/>
+          <w:sz w:val="28"/>
+        </w:rPr>
+        <w:tab/>
+      </w:r>
+      <w:r>
+        <w:rPr>
+          <w:rFonts w:ascii="Times New Roman" w:hAnsi="Times New Roman" w:cs="Times New Roman"/>
+          <w:sz w:val="28"/>
+          <w:szCs w:val="28"/>
+        </w:rPr>
+        <w:t xml:space="preserve">30</w:t>
+      </w:r>
+    </w:p>
+    <w:p>
+      <w:pPr>
+        <w:pStyle w:val="TOC3"/>
+        <w:tabs>
+          <w:tab w:val="right" w:leader="dot" w:pos="9355"/>
+        </w:tabs>
+        <w:spacing w:after="60" w:line="360" w:lineRule="auto"/>
+      </w:pPr>
+      <w:r>
+        <w:rPr>
+          <w:rFonts w:ascii="Times New Roman" w:hAnsi="Times New Roman" w:cs="Times New Roman"/>
+          <w:sz w:val="28"/>
+          <w:szCs w:val="28"/>
+        </w:rPr>
+        <w:t xml:space="preserve">4.2.1 Models and Hyper-parameter Tuning</w:t>
+      </w:r>
+      <w:r>
+        <w:rPr>
+          <w:rFonts w:ascii="Times New Roman" w:hAnsi="Times New Roman"/>
+          <w:sz w:val="28"/>
+        </w:rPr>
+        <w:tab/>
+      </w:r>
+      <w:r>
+        <w:rPr>
+          <w:rFonts w:ascii="Times New Roman" w:hAnsi="Times New Roman" w:cs="Times New Roman"/>
+          <w:sz w:val="28"/>
+          <w:szCs w:val="28"/>
+        </w:rPr>
+        <w:t xml:space="preserve">30</w:t>
+      </w:r>
+    </w:p>
+    <w:p>
+      <w:pPr>
+        <w:pStyle w:val="TOC3"/>
+        <w:tabs>
+          <w:tab w:val="right" w:leader="dot" w:pos="9355"/>
+        </w:tabs>
+        <w:spacing w:after="60" w:line="360" w:lineRule="auto"/>
+      </w:pPr>
+      <w:r>
+        <w:rPr>
+          <w:rFonts w:ascii="Times New Roman" w:hAnsi="Times New Roman" w:cs="Times New Roman"/>
+          <w:sz w:val="28"/>
+          <w:szCs w:val="28"/>
+        </w:rPr>
+        <w:t xml:space="preserve">4.2.2 Evaluation Metrics</w:t>
+      </w:r>
+      <w:r>
+        <w:rPr>
+          <w:rFonts w:ascii="Times New Roman" w:hAnsi="Times New Roman"/>
+          <w:sz w:val="28"/>
+        </w:rPr>
+        <w:tab/>
+      </w:r>
+      <w:r>
+        <w:rPr>
+          <w:rFonts w:ascii="Times New Roman" w:hAnsi="Times New Roman" w:cs="Times New Roman"/>
+          <w:sz w:val="28"/>
+          <w:szCs w:val="28"/>
+        </w:rPr>
+        <w:t xml:space="preserve">30</w:t>
+      </w:r>
+    </w:p>
+    <w:p>
+      <w:pPr>
+        <w:pStyle w:val="TOC2"/>
+        <w:tabs>
+          <w:tab w:val="right" w:leader="dot" w:pos="9355"/>
+        </w:tabs>
+        <w:spacing w:after="60" w:line="360" w:lineRule="auto"/>
+      </w:pPr>
+      <w:r>
+        <w:rPr>
+          <w:rFonts w:ascii="Times New Roman" w:hAnsi="Times New Roman" w:cs="Times New Roman"/>
+          <w:sz w:val="28"/>
+          <w:szCs w:val="28"/>
+        </w:rPr>
+        <w:t xml:space="preserve">4.3 Findings</w:t>
+      </w:r>
+      <w:r>
+        <w:rPr>
+          <w:rFonts w:ascii="Times New Roman" w:hAnsi="Times New Roman"/>
+          <w:sz w:val="28"/>
+        </w:rPr>
+        <w:tab/>
+      </w:r>
+      <w:r>
+        <w:rPr>
+          <w:rFonts w:ascii="Times New Roman" w:hAnsi="Times New Roman" w:cs="Times New Roman"/>
+          <w:sz w:val="28"/>
+          <w:szCs w:val="28"/>
+        </w:rPr>
+        <w:t xml:space="preserve">31</w:t>
+      </w:r>
+    </w:p>
+    <w:p>
+      <w:pPr>
+        <w:pStyle w:val="TOC3"/>
+        <w:tabs>
+          <w:tab w:val="right" w:leader="dot" w:pos="9355"/>
+        </w:tabs>
+        <w:spacing w:after="60" w:line="360" w:lineRule="auto"/>
+      </w:pPr>
+      <w:r>
+        <w:rPr>
+          <w:rFonts w:ascii="Times New Roman" w:hAnsi="Times New Roman" w:cs="Times New Roman"/>
+          <w:sz w:val="28"/>
+          <w:szCs w:val="28"/>
+        </w:rPr>
+        <w:t xml:space="preserve">4.3.1 Sample Profile</w:t>
+      </w:r>
+      <w:r>
+        <w:rPr>
+          <w:rFonts w:ascii="Times New Roman" w:hAnsi="Times New Roman"/>
+          <w:sz w:val="28"/>
+        </w:rPr>
+        <w:tab/>
+      </w:r>
+      <w:r>
+        <w:rPr>
+          <w:rFonts w:ascii="Times New Roman" w:hAnsi="Times New Roman" w:cs="Times New Roman"/>
+          <w:sz w:val="28"/>
+          <w:szCs w:val="28"/>
+        </w:rPr>
+        <w:t xml:space="preserve">31</w:t>
+      </w:r>
+    </w:p>
+    <w:p>
+      <w:pPr>
+        <w:pStyle w:val="TOC3"/>
+        <w:tabs>
+          <w:tab w:val="right" w:leader="dot" w:pos="9355"/>
+        </w:tabs>
+        <w:spacing w:after="60" w:line="360" w:lineRule="auto"/>
+      </w:pPr>
+      <w:r>
+        <w:rPr>
+          <w:rFonts w:ascii="Times New Roman" w:hAnsi="Times New Roman" w:cs="Times New Roman"/>
+          <w:sz w:val="28"/>
+          <w:szCs w:val="28"/>
+        </w:rPr>
+        <w:t xml:space="preserve">4.3.2 Overall Model Performance</w:t>
+      </w:r>
+      <w:r>
+        <w:rPr>
+          <w:rFonts w:ascii="Times New Roman" w:hAnsi="Times New Roman"/>
+          <w:sz w:val="28"/>
+        </w:rPr>
+        <w:tab/>
+      </w:r>
+      <w:r>
+        <w:rPr>
+          <w:rFonts w:ascii="Times New Roman" w:hAnsi="Times New Roman" w:cs="Times New Roman"/>
+          <w:sz w:val="28"/>
+          <w:szCs w:val="28"/>
+        </w:rPr>
+        <w:t xml:space="preserve">31</w:t>
+      </w:r>
+    </w:p>
+    <w:p>
+      <w:pPr>
+        <w:pStyle w:val="TOC3"/>
+        <w:tabs>
+          <w:tab w:val="right" w:leader="dot" w:pos="9355"/>
+        </w:tabs>
+        <w:spacing w:after="60" w:line="360" w:lineRule="auto"/>
+      </w:pPr>
+      <w:r>
+        <w:rPr>
+          <w:rFonts w:ascii="Times New Roman" w:hAnsi="Times New Roman" w:cs="Times New Roman"/>
+          <w:sz w:val="28"/>
+          <w:szCs w:val="28"/>
+        </w:rPr>
+        <w:t xml:space="preserve">4.3.3 Best-Model Detail</w:t>
+      </w:r>
+      <w:r>
+        <w:rPr>
+          <w:rFonts w:ascii="Times New Roman" w:hAnsi="Times New Roman"/>
+          <w:sz w:val="28"/>
+        </w:rPr>
+        <w:tab/>
+      </w:r>
+      <w:r>
+        <w:rPr>
+          <w:rFonts w:ascii="Times New Roman" w:hAnsi="Times New Roman" w:cs="Times New Roman"/>
+          <w:sz w:val="28"/>
+          <w:szCs w:val="28"/>
+        </w:rPr>
+        <w:t xml:space="preserve">32</w:t>
+      </w:r>
+    </w:p>
+    <w:p>
+      <w:pPr>
+        <w:pStyle w:val="TOC3"/>
+        <w:tabs>
+          <w:tab w:val="right" w:leader="dot" w:pos="9355"/>
+        </w:tabs>
+        <w:spacing w:after="60" w:line="360" w:lineRule="auto"/>
+      </w:pPr>
+      <w:r>
+        <w:rPr>
+          <w:rFonts w:ascii="Times New Roman" w:hAnsi="Times New Roman" w:cs="Times New Roman"/>
+          <w:sz w:val="28"/>
+          <w:szCs w:val="28"/>
+        </w:rPr>
+        <w:t xml:space="preserve">4.3.4 Computational Cost</w:t>
+      </w:r>
+      <w:r>
+        <w:rPr>
+          <w:rFonts w:ascii="Times New Roman" w:hAnsi="Times New Roman"/>
+          <w:sz w:val="28"/>
+        </w:rPr>
+        <w:tab/>
+      </w:r>
+      <w:r>
+        <w:rPr>
+          <w:rFonts w:ascii="Times New Roman" w:hAnsi="Times New Roman" w:cs="Times New Roman"/>
+          <w:sz w:val="28"/>
+          <w:szCs w:val="28"/>
+        </w:rPr>
+        <w:t xml:space="preserve">33</w:t>
+      </w:r>
+    </w:p>
+    <w:p>
+      <w:pPr>
+        <w:pStyle w:val="TOC2"/>
+        <w:tabs>
+          <w:tab w:val="right" w:leader="dot" w:pos="9355"/>
+        </w:tabs>
+        <w:spacing w:after="60" w:line="360" w:lineRule="auto"/>
+      </w:pPr>
+      <w:r>
+        <w:rPr>
+          <w:rFonts w:ascii="Times New Roman" w:hAnsi="Times New Roman" w:cs="Times New Roman"/>
+          <w:sz w:val="28"/>
+          <w:szCs w:val="28"/>
+        </w:rPr>
+        <w:t xml:space="preserve">4.4 Comparison of Patterns and Trends</w:t>
+      </w:r>
+      <w:r>
+        <w:rPr>
+          <w:rFonts w:ascii="Times New Roman" w:hAnsi="Times New Roman"/>
+          <w:sz w:val="28"/>
+        </w:rPr>
+        <w:tab/>
+      </w:r>
+      <w:r>
+        <w:rPr>
+          <w:rFonts w:ascii="Times New Roman" w:hAnsi="Times New Roman" w:cs="Times New Roman"/>
+          <w:sz w:val="28"/>
+          <w:szCs w:val="28"/>
+        </w:rPr>
+        <w:t xml:space="preserve">33</w:t>
+      </w:r>
+    </w:p>
+    <w:p>
+      <w:pPr>
+        <w:pStyle w:val="TOC1"/>
+        <w:tabs>
+          <w:tab w:val="right" w:leader="dot" w:pos="9355"/>
+        </w:tabs>
+        <w:spacing w:after="60" w:line="360" w:lineRule="auto"/>
+      </w:pPr>
+      <w:r>
+        <w:rPr>
+          <w:rFonts w:ascii="Times New Roman" w:hAnsi="Times New Roman" w:cs="Times New Roman"/>
+          <w:b/>
+          <w:sz w:val="28"/>
+          <w:szCs w:val="28"/>
+        </w:rPr>
+        <w:t xml:space="preserve">Chapter 5 — Discussion</w:t>
+      </w:r>
+      <w:r>
+        <w:rPr>
+          <w:rFonts w:ascii="Times New Roman" w:hAnsi="Times New Roman"/>
+          <w:sz w:val="28"/>
+        </w:rPr>
+        <w:tab/>
+      </w:r>
+      <w:r>
+        <w:rPr>
+          <w:rFonts w:ascii="Times New Roman" w:hAnsi="Times New Roman" w:cs="Times New Roman"/>
+          <w:b/>
+          <w:sz w:val="28"/>
+          <w:szCs w:val="28"/>
+        </w:rPr>
+        <w:t xml:space="preserve">35</w:t>
+      </w:r>
+    </w:p>
+    <w:p>
+      <w:pPr>
+        <w:pStyle w:val="TOC2"/>
+        <w:tabs>
+          <w:tab w:val="right" w:leader="dot" w:pos="9355"/>
+        </w:tabs>
+        <w:spacing w:after="60" w:line="360" w:lineRule="auto"/>
+      </w:pPr>
+      <w:r>
+        <w:rPr>
+          <w:rFonts w:ascii="Times New Roman" w:hAnsi="Times New Roman" w:cs="Times New Roman"/>
+          <w:sz w:val="28"/>
+          <w:szCs w:val="28"/>
+        </w:rPr>
+        <w:t xml:space="preserve">5.1 Interpretation of Findings</w:t>
+      </w:r>
+      <w:r>
+        <w:rPr>
+          <w:rFonts w:ascii="Times New Roman" w:hAnsi="Times New Roman"/>
+          <w:sz w:val="28"/>
+        </w:rPr>
+        <w:tab/>
+      </w:r>
+      <w:r>
+        <w:rPr>
+          <w:rFonts w:ascii="Times New Roman" w:hAnsi="Times New Roman" w:cs="Times New Roman"/>
+          <w:sz w:val="28"/>
+          <w:szCs w:val="28"/>
+        </w:rPr>
+        <w:t xml:space="preserve">35</w:t>
+      </w:r>
+    </w:p>
+    <w:p>
+      <w:pPr>
+        <w:pStyle w:val="TOC2"/>
+        <w:tabs>
+          <w:tab w:val="right" w:leader="dot" w:pos="9355"/>
+        </w:tabs>
+        <w:spacing w:after="60" w:line="360" w:lineRule="auto"/>
+      </w:pPr>
+      <w:r>
+        <w:rPr>
+          <w:rFonts w:ascii="Times New Roman" w:hAnsi="Times New Roman" w:cs="Times New Roman"/>
+          <w:sz w:val="28"/>
+          <w:szCs w:val="28"/>
+        </w:rPr>
+        <w:t xml:space="preserve">5.2 Comparison with the Literature</w:t>
+      </w:r>
+      <w:r>
+        <w:rPr>
+          <w:rFonts w:ascii="Times New Roman" w:hAnsi="Times New Roman"/>
+          <w:sz w:val="28"/>
+        </w:rPr>
+        <w:tab/>
+      </w:r>
+      <w:r>
+        <w:rPr>
+          <w:rFonts w:ascii="Times New Roman" w:hAnsi="Times New Roman" w:cs="Times New Roman"/>
+          <w:sz w:val="28"/>
+          <w:szCs w:val="28"/>
+        </w:rPr>
+        <w:t xml:space="preserve">35</w:t>
+      </w:r>
+    </w:p>
+    <w:p>
+      <w:pPr>
+        <w:pStyle w:val="TOC2"/>
+        <w:tabs>
+          <w:tab w:val="right" w:leader="dot" w:pos="9355"/>
+        </w:tabs>
+        <w:spacing w:after="60" w:line="360" w:lineRule="auto"/>
+      </w:pPr>
+      <w:r>
+        <w:rPr>
+          <w:rFonts w:ascii="Times New Roman" w:hAnsi="Times New Roman" w:cs="Times New Roman"/>
+          <w:sz w:val="28"/>
+          <w:szCs w:val="28"/>
+        </w:rPr>
+        <w:t xml:space="preserve">5.3 Validity</w:t>
+      </w:r>
+      <w:r>
+        <w:rPr>
+          <w:rFonts w:ascii="Times New Roman" w:hAnsi="Times New Roman"/>
+          <w:sz w:val="28"/>
+        </w:rPr>
+        <w:tab/>
+      </w:r>
+      <w:r>
+        <w:rPr>
+          <w:rFonts w:ascii="Times New Roman" w:hAnsi="Times New Roman" w:cs="Times New Roman"/>
+          <w:sz w:val="28"/>
+          <w:szCs w:val="28"/>
+        </w:rPr>
+        <w:t xml:space="preserve">36</w:t>
+      </w:r>
+    </w:p>
+    <w:p>
+      <w:pPr>
+        <w:pStyle w:val="TOC2"/>
+        <w:tabs>
+          <w:tab w:val="right" w:leader="dot" w:pos="9355"/>
+        </w:tabs>
+        <w:spacing w:after="60" w:line="360" w:lineRule="auto"/>
+      </w:pPr>
+      <w:r>
+        <w:rPr>
+          <w:rFonts w:ascii="Times New Roman" w:hAnsi="Times New Roman" w:cs="Times New Roman"/>
+          <w:sz w:val="28"/>
+          <w:szCs w:val="28"/>
+        </w:rPr>
+        <w:t xml:space="preserve">5.4 Reliability</w:t>
+      </w:r>
+      <w:r>
+        <w:rPr>
+          <w:rFonts w:ascii="Times New Roman" w:hAnsi="Times New Roman"/>
+          <w:sz w:val="28"/>
+        </w:rPr>
+        <w:tab/>
+      </w:r>
+      <w:r>
+        <w:rPr>
+          <w:rFonts w:ascii="Times New Roman" w:hAnsi="Times New Roman" w:cs="Times New Roman"/>
+          <w:sz w:val="28"/>
+          <w:szCs w:val="28"/>
+        </w:rPr>
+        <w:t xml:space="preserve">36</w:t>
+      </w:r>
+    </w:p>
+    <w:p>
+      <w:pPr>
+        <w:pStyle w:val="TOC2"/>
+        <w:tabs>
+          <w:tab w:val="right" w:leader="dot" w:pos="9355"/>
+        </w:tabs>
+        <w:spacing w:after="60" w:line="360" w:lineRule="auto"/>
+      </w:pPr>
+      <w:r>
+        <w:rPr>
+          <w:rFonts w:ascii="Times New Roman" w:hAnsi="Times New Roman" w:cs="Times New Roman"/>
+          <w:sz w:val="28"/>
+          <w:szCs w:val="28"/>
+        </w:rPr>
+        <w:t xml:space="preserve">5.5 Project Effectiveness Evaluation</w:t>
+      </w:r>
+      <w:r>
+        <w:rPr>
+          <w:rFonts w:ascii="Times New Roman" w:hAnsi="Times New Roman"/>
+          <w:sz w:val="28"/>
+        </w:rPr>
+        <w:tab/>
+      </w:r>
+      <w:r>
+        <w:rPr>
+          <w:rFonts w:ascii="Times New Roman" w:hAnsi="Times New Roman" w:cs="Times New Roman"/>
+          <w:sz w:val="28"/>
+          <w:szCs w:val="28"/>
+        </w:rPr>
+        <w:t xml:space="preserve">36</w:t>
+      </w:r>
+    </w:p>
+    <w:p>
+      <w:pPr>
+        <w:pStyle w:val="TOC2"/>
+        <w:tabs>
+          <w:tab w:val="right" w:leader="dot" w:pos="9355"/>
+        </w:tabs>
+        <w:spacing w:after="60" w:line="360" w:lineRule="auto"/>
+      </w:pPr>
+      <w:r>
+        <w:rPr>
+          <w:rFonts w:ascii="Times New Roman" w:hAnsi="Times New Roman" w:cs="Times New Roman"/>
+          <w:sz w:val="28"/>
+          <w:szCs w:val="28"/>
+        </w:rPr>
+        <w:t xml:space="preserve">5.6 Limitations</w:t>
+      </w:r>
+      <w:r>
+        <w:rPr>
+          <w:rFonts w:ascii="Times New Roman" w:hAnsi="Times New Roman"/>
+          <w:sz w:val="28"/>
+        </w:rPr>
+        <w:tab/>
+      </w:r>
+      <w:r>
+        <w:rPr>
+          <w:rFonts w:ascii="Times New Roman" w:hAnsi="Times New Roman" w:cs="Times New Roman"/>
+          <w:sz w:val="28"/>
+          <w:szCs w:val="28"/>
+        </w:rPr>
+        <w:t xml:space="preserve">37</w:t>
+      </w:r>
+    </w:p>
+    <w:p>
+      <w:pPr>
+        <w:pStyle w:val="TOC2"/>
+        <w:tabs>
+          <w:tab w:val="right" w:leader="dot" w:pos="9355"/>
+        </w:tabs>
+        <w:spacing w:after="60" w:line="360" w:lineRule="auto"/>
+      </w:pPr>
+      <w:r>
+        <w:rPr>
+          <w:rFonts w:ascii="Times New Roman" w:hAnsi="Times New Roman" w:cs="Times New Roman"/>
+          <w:sz w:val="28"/>
+          <w:szCs w:val="28"/>
+        </w:rPr>
+        <w:t xml:space="preserve">5.7 Implications for Practice and Future Research</w:t>
+      </w:r>
+      <w:r>
+        <w:rPr>
+          <w:rFonts w:ascii="Times New Roman" w:hAnsi="Times New Roman"/>
+          <w:sz w:val="28"/>
+        </w:rPr>
+        <w:tab/>
+      </w:r>
+      <w:r>
+        <w:rPr>
+          <w:rFonts w:ascii="Times New Roman" w:hAnsi="Times New Roman" w:cs="Times New Roman"/>
+          <w:sz w:val="28"/>
+          <w:szCs w:val="28"/>
+        </w:rPr>
+        <w:t xml:space="preserve">37</w:t>
+      </w:r>
+    </w:p>
+    <w:p>
+      <w:pPr>
+        <w:pStyle w:val="TOC1"/>
+        <w:tabs>
+          <w:tab w:val="right" w:leader="dot" w:pos="9355"/>
+        </w:tabs>
+        <w:spacing w:after="60" w:line="360" w:lineRule="auto"/>
+      </w:pPr>
+      <w:r>
+        <w:rPr>
+          <w:rFonts w:ascii="Times New Roman" w:hAnsi="Times New Roman" w:cs="Times New Roman"/>
+          <w:b/>
+          <w:sz w:val="28"/>
+          <w:szCs w:val="28"/>
+        </w:rPr>
+        <w:t xml:space="preserve">Chapter 6 — Conclusion and Recommendations</w:t>
+      </w:r>
+      <w:r>
+        <w:rPr>
+          <w:rFonts w:ascii="Times New Roman" w:hAnsi="Times New Roman"/>
+          <w:sz w:val="28"/>
+        </w:rPr>
+        <w:tab/>
+      </w:r>
+      <w:r>
+        <w:rPr>
+          <w:rFonts w:ascii="Times New Roman" w:hAnsi="Times New Roman" w:cs="Times New Roman"/>
+          <w:b/>
+          <w:sz w:val="28"/>
+          <w:szCs w:val="28"/>
+        </w:rPr>
+        <w:t xml:space="preserve">38</w:t>
+      </w:r>
+    </w:p>
+    <w:p>
+      <w:pPr>
+        <w:pStyle w:val="TOC2"/>
+        <w:tabs>
+          <w:tab w:val="right" w:leader="dot" w:pos="9355"/>
+        </w:tabs>
+        <w:spacing w:after="60" w:line="360" w:lineRule="auto"/>
+      </w:pPr>
+      <w:r>
+        <w:rPr>
+          <w:rFonts w:ascii="Times New Roman" w:hAnsi="Times New Roman" w:cs="Times New Roman"/>
+          <w:sz w:val="28"/>
+          <w:szCs w:val="28"/>
+        </w:rPr>
+        <w:t xml:space="preserve">6.1 Summary of the Project</w:t>
+      </w:r>
+      <w:r>
+        <w:rPr>
+          <w:rFonts w:ascii="Times New Roman" w:hAnsi="Times New Roman"/>
+          <w:sz w:val="28"/>
+        </w:rPr>
+        <w:tab/>
+      </w:r>
+      <w:r>
+        <w:rPr>
+          <w:rFonts w:ascii="Times New Roman" w:hAnsi="Times New Roman" w:cs="Times New Roman"/>
+          <w:sz w:val="28"/>
+          <w:szCs w:val="28"/>
+        </w:rPr>
+        <w:t xml:space="preserve">38</w:t>
+      </w:r>
+    </w:p>
+    <w:p>
+      <w:pPr>
+        <w:pStyle w:val="TOC2"/>
+        <w:tabs>
+          <w:tab w:val="right" w:leader="dot" w:pos="9355"/>
+        </w:tabs>
+        <w:spacing w:after="60" w:line="360" w:lineRule="auto"/>
+      </w:pPr>
+      <w:r>
+        <w:rPr>
+          <w:rFonts w:ascii="Times New Roman" w:hAnsi="Times New Roman" w:cs="Times New Roman"/>
+          <w:sz w:val="28"/>
+          <w:szCs w:val="28"/>
+        </w:rPr>
+        <w:t xml:space="preserve">6.2 Achievement of Objectives</w:t>
+      </w:r>
+      <w:r>
+        <w:rPr>
+          <w:rFonts w:ascii="Times New Roman" w:hAnsi="Times New Roman"/>
+          <w:sz w:val="28"/>
+        </w:rPr>
+        <w:tab/>
+      </w:r>
+      <w:r>
+        <w:rPr>
+          <w:rFonts w:ascii="Times New Roman" w:hAnsi="Times New Roman" w:cs="Times New Roman"/>
+          <w:sz w:val="28"/>
+          <w:szCs w:val="28"/>
+        </w:rPr>
+        <w:t xml:space="preserve">38</w:t>
+      </w:r>
+    </w:p>
+    <w:p>
+      <w:pPr>
+        <w:pStyle w:val="TOC2"/>
+        <w:tabs>
+          <w:tab w:val="right" w:leader="dot" w:pos="9355"/>
+        </w:tabs>
+        <w:spacing w:after="60" w:line="360" w:lineRule="auto"/>
+      </w:pPr>
+      <w:r>
+        <w:rPr>
+          <w:rFonts w:ascii="Times New Roman" w:hAnsi="Times New Roman" w:cs="Times New Roman"/>
+          <w:sz w:val="28"/>
+          <w:szCs w:val="28"/>
+        </w:rPr>
+        <w:t xml:space="preserve">6.3 Contribution to Knowledge and Practice</w:t>
+      </w:r>
+      <w:r>
+        <w:rPr>
+          <w:rFonts w:ascii="Times New Roman" w:hAnsi="Times New Roman"/>
+          <w:sz w:val="28"/>
+        </w:rPr>
+        <w:tab/>
+      </w:r>
+      <w:r>
+        <w:rPr>
+          <w:rFonts w:ascii="Times New Roman" w:hAnsi="Times New Roman" w:cs="Times New Roman"/>
+          <w:sz w:val="28"/>
+          <w:szCs w:val="28"/>
+        </w:rPr>
+        <w:t xml:space="preserve">38</w:t>
+      </w:r>
+    </w:p>
+    <w:p>
+      <w:pPr>
+        <w:pStyle w:val="TOC2"/>
+        <w:tabs>
+          <w:tab w:val="right" w:leader="dot" w:pos="9355"/>
+        </w:tabs>
+        <w:spacing w:after="60" w:line="360" w:lineRule="auto"/>
+      </w:pPr>
+      <w:r>
+        <w:rPr>
+          <w:rFonts w:ascii="Times New Roman" w:hAnsi="Times New Roman" w:cs="Times New Roman"/>
+          <w:sz w:val="28"/>
+          <w:szCs w:val="28"/>
+        </w:rPr>
+        <w:t xml:space="preserve">6.4 Recommendations</w:t>
+      </w:r>
+      <w:r>
+        <w:rPr>
+          <w:rFonts w:ascii="Times New Roman" w:hAnsi="Times New Roman"/>
+          <w:sz w:val="28"/>
+        </w:rPr>
+        <w:tab/>
+      </w:r>
+      <w:r>
+        <w:rPr>
+          <w:rFonts w:ascii="Times New Roman" w:hAnsi="Times New Roman" w:cs="Times New Roman"/>
+          <w:sz w:val="28"/>
+          <w:szCs w:val="28"/>
+        </w:rPr>
+        <w:t xml:space="preserve">39</w:t>
+      </w:r>
+    </w:p>
+    <w:p>
+      <w:pPr>
+        <w:pStyle w:val="TOC3"/>
+        <w:tabs>
+          <w:tab w:val="right" w:leader="dot" w:pos="9355"/>
+        </w:tabs>
+        <w:spacing w:after="60" w:line="360" w:lineRule="auto"/>
+      </w:pPr>
+      <w:r>
+        <w:rPr>
+          <w:rFonts w:ascii="Times New Roman" w:hAnsi="Times New Roman" w:cs="Times New Roman"/>
+          <w:sz w:val="28"/>
+          <w:szCs w:val="28"/>
+        </w:rPr>
+        <w:t xml:space="preserve">6.4.1 For Practitioners and Industry</w:t>
+      </w:r>
+      <w:r>
+        <w:rPr>
+          <w:rFonts w:ascii="Times New Roman" w:hAnsi="Times New Roman"/>
+          <w:sz w:val="28"/>
+        </w:rPr>
+        <w:tab/>
+      </w:r>
+      <w:r>
+        <w:rPr>
+          <w:rFonts w:ascii="Times New Roman" w:hAnsi="Times New Roman" w:cs="Times New Roman"/>
+          <w:sz w:val="28"/>
+          <w:szCs w:val="28"/>
+        </w:rPr>
+        <w:t xml:space="preserve">39</w:t>
+      </w:r>
+    </w:p>
+    <w:p>
+      <w:pPr>
+        <w:pStyle w:val="TOC3"/>
+        <w:tabs>
+          <w:tab w:val="right" w:leader="dot" w:pos="9355"/>
+        </w:tabs>
+        <w:spacing w:after="60" w:line="360" w:lineRule="auto"/>
+      </w:pPr>
+      <w:r>
+        <w:rPr>
+          <w:rFonts w:ascii="Times New Roman" w:hAnsi="Times New Roman" w:cs="Times New Roman"/>
+          <w:sz w:val="28"/>
+          <w:szCs w:val="28"/>
+        </w:rPr>
+        <w:t xml:space="preserve">6.4.2 For Future Researchers</w:t>
+      </w:r>
+      <w:r>
+        <w:rPr>
+          <w:rFonts w:ascii="Times New Roman" w:hAnsi="Times New Roman"/>
+          <w:sz w:val="28"/>
+        </w:rPr>
+        <w:tab/>
+      </w:r>
+      <w:r>
+        <w:rPr>
+          <w:rFonts w:ascii="Times New Roman" w:hAnsi="Times New Roman" w:cs="Times New Roman"/>
+          <w:sz w:val="28"/>
+          <w:szCs w:val="28"/>
+        </w:rPr>
+        <w:t xml:space="preserve">39</w:t>
+      </w:r>
+    </w:p>
+    <w:p>
+      <w:pPr>
+        <w:pStyle w:val="TOC2"/>
+        <w:tabs>
+          <w:tab w:val="right" w:leader="dot" w:pos="9355"/>
+        </w:tabs>
+        <w:spacing w:after="60" w:line="360" w:lineRule="auto"/>
+      </w:pPr>
+      <w:r>
+        <w:rPr>
+          <w:rFonts w:ascii="Times New Roman" w:hAnsi="Times New Roman" w:cs="Times New Roman"/>
+          <w:sz w:val="28"/>
+          <w:szCs w:val="28"/>
+        </w:rPr>
+        <w:t xml:space="preserve">6.5 Closing Remarks</w:t>
+      </w:r>
+      <w:r>
+        <w:rPr>
+          <w:rFonts w:ascii="Times New Roman" w:hAnsi="Times New Roman"/>
+          <w:sz w:val="28"/>
+        </w:rPr>
+        <w:tab/>
+      </w:r>
+      <w:r>
+        <w:rPr>
+          <w:rFonts w:ascii="Times New Roman" w:hAnsi="Times New Roman" w:cs="Times New Roman"/>
+          <w:sz w:val="28"/>
+          <w:szCs w:val="28"/>
+        </w:rPr>
+        <w:t xml:space="preserve">39</w:t>
+      </w:r>
+    </w:p>
+    <w:p>
+      <w:pPr>
+        <w:pStyle w:val="TOC1"/>
+        <w:tabs>
+          <w:tab w:val="right" w:leader="dot" w:pos="9355"/>
+        </w:tabs>
+        <w:spacing w:after="60" w:line="360" w:lineRule="auto"/>
+      </w:pPr>
+      <w:r>
+        <w:rPr>
+          <w:rFonts w:ascii="Times New Roman" w:hAnsi="Times New Roman" w:cs="Times New Roman"/>
+          <w:b/>
+          <w:sz w:val="28"/>
+          <w:szCs w:val="28"/>
+        </w:rPr>
+        <w:t xml:space="preserve">Chapter 7 — Reflective Evaluation of Personal and Professional Development</w:t>
+      </w:r>
+      <w:r>
+        <w:rPr>
+          <w:rFonts w:ascii="Times New Roman" w:hAnsi="Times New Roman"/>
+          <w:sz w:val="28"/>
+        </w:rPr>
+        <w:tab/>
+      </w:r>
+      <w:r>
+        <w:rPr>
+          <w:rFonts w:ascii="Times New Roman" w:hAnsi="Times New Roman" w:cs="Times New Roman"/>
+          <w:b/>
+          <w:sz w:val="28"/>
+          <w:szCs w:val="28"/>
+        </w:rPr>
+        <w:t xml:space="preserve">40</w:t>
+      </w:r>
+    </w:p>
+    <w:p>
+      <w:pPr>
+        <w:pStyle w:val="TOC2"/>
+        <w:tabs>
+          <w:tab w:val="right" w:leader="dot" w:pos="9355"/>
+        </w:tabs>
+        <w:spacing w:after="60" w:line="360" w:lineRule="auto"/>
+      </w:pPr>
+      <w:r>
+        <w:rPr>
+          <w:rFonts w:ascii="Times New Roman" w:hAnsi="Times New Roman" w:cs="Times New Roman"/>
+          <w:sz w:val="28"/>
+          <w:szCs w:val="28"/>
+        </w:rPr>
+        <w:t xml:space="preserve">7.1 Choice of Reflective Model</w:t>
+      </w:r>
+      <w:r>
+        <w:rPr>
+          <w:rFonts w:ascii="Times New Roman" w:hAnsi="Times New Roman"/>
+          <w:sz w:val="28"/>
+        </w:rPr>
+        <w:tab/>
+      </w:r>
+      <w:r>
+        <w:rPr>
+          <w:rFonts w:ascii="Times New Roman" w:hAnsi="Times New Roman" w:cs="Times New Roman"/>
+          <w:sz w:val="28"/>
+          <w:szCs w:val="28"/>
+        </w:rPr>
+        <w:t xml:space="preserve">40</w:t>
+      </w:r>
+    </w:p>
+    <w:p>
+      <w:pPr>
+        <w:pStyle w:val="TOC2"/>
+        <w:tabs>
+          <w:tab w:val="right" w:leader="dot" w:pos="9355"/>
+        </w:tabs>
+        <w:spacing w:after="60" w:line="360" w:lineRule="auto"/>
+      </w:pPr>
+      <w:r>
+        <w:rPr>
+          <w:rFonts w:ascii="Times New Roman" w:hAnsi="Times New Roman" w:cs="Times New Roman"/>
+          <w:sz w:val="28"/>
+          <w:szCs w:val="28"/>
+        </w:rPr>
+        <w:t xml:space="preserve">7.2 Reflection Using Gibbs' Cycle</w:t>
+      </w:r>
+      <w:r>
+        <w:rPr>
+          <w:rFonts w:ascii="Times New Roman" w:hAnsi="Times New Roman"/>
+          <w:sz w:val="28"/>
+        </w:rPr>
+        <w:tab/>
+      </w:r>
+      <w:r>
+        <w:rPr>
+          <w:rFonts w:ascii="Times New Roman" w:hAnsi="Times New Roman" w:cs="Times New Roman"/>
+          <w:sz w:val="28"/>
+          <w:szCs w:val="28"/>
+        </w:rPr>
+        <w:t xml:space="preserve">40</w:t>
+      </w:r>
+    </w:p>
+    <w:p>
+      <w:pPr>
+        <w:pStyle w:val="TOC3"/>
+        <w:tabs>
+          <w:tab w:val="right" w:leader="dot" w:pos="9355"/>
+        </w:tabs>
+        <w:spacing w:after="60" w:line="360" w:lineRule="auto"/>
+      </w:pPr>
+      <w:r>
+        <w:rPr>
+          <w:rFonts w:ascii="Times New Roman" w:hAnsi="Times New Roman" w:cs="Times New Roman"/>
+          <w:sz w:val="28"/>
+          <w:szCs w:val="28"/>
+        </w:rPr>
+        <w:t xml:space="preserve">7.2.1 Description — What Happened?</w:t>
+      </w:r>
+      <w:r>
+        <w:rPr>
+          <w:rFonts w:ascii="Times New Roman" w:hAnsi="Times New Roman"/>
+          <w:sz w:val="28"/>
+        </w:rPr>
+        <w:tab/>
+      </w:r>
+      <w:r>
+        <w:rPr>
+          <w:rFonts w:ascii="Times New Roman" w:hAnsi="Times New Roman" w:cs="Times New Roman"/>
+          <w:sz w:val="28"/>
+          <w:szCs w:val="28"/>
+        </w:rPr>
+        <w:t xml:space="preserve">40</w:t>
+      </w:r>
+    </w:p>
+    <w:p>
+      <w:pPr>
+        <w:pStyle w:val="TOC3"/>
+        <w:tabs>
+          <w:tab w:val="right" w:leader="dot" w:pos="9355"/>
+        </w:tabs>
+        <w:spacing w:after="60" w:line="360" w:lineRule="auto"/>
+      </w:pPr>
+      <w:r>
+        <w:rPr>
+          <w:rFonts w:ascii="Times New Roman" w:hAnsi="Times New Roman" w:cs="Times New Roman"/>
+          <w:sz w:val="28"/>
+          <w:szCs w:val="28"/>
+        </w:rPr>
+        <w:t xml:space="preserve">7.2.2 Feelings — What Was I Thinking and Feeling?</w:t>
+      </w:r>
+      <w:r>
+        <w:rPr>
+          <w:rFonts w:ascii="Times New Roman" w:hAnsi="Times New Roman"/>
+          <w:sz w:val="28"/>
+        </w:rPr>
+        <w:tab/>
+      </w:r>
+      <w:r>
+        <w:rPr>
+          <w:rFonts w:ascii="Times New Roman" w:hAnsi="Times New Roman" w:cs="Times New Roman"/>
+          <w:sz w:val="28"/>
+          <w:szCs w:val="28"/>
+        </w:rPr>
+        <w:t xml:space="preserve">40</w:t>
+      </w:r>
+    </w:p>
+    <w:p>
+      <w:pPr>
+        <w:pStyle w:val="TOC3"/>
+        <w:tabs>
+          <w:tab w:val="right" w:leader="dot" w:pos="9355"/>
+        </w:tabs>
+        <w:spacing w:after="60" w:line="360" w:lineRule="auto"/>
+      </w:pPr>
+      <w:r>
+        <w:rPr>
+          <w:rFonts w:ascii="Times New Roman" w:hAnsi="Times New Roman" w:cs="Times New Roman"/>
+          <w:sz w:val="28"/>
+          <w:szCs w:val="28"/>
+        </w:rPr>
+        <w:t xml:space="preserve">7.2.3 Evaluation — What Was Good and Bad?</w:t>
+      </w:r>
+      <w:r>
+        <w:rPr>
+          <w:rFonts w:ascii="Times New Roman" w:hAnsi="Times New Roman"/>
+          <w:sz w:val="28"/>
+        </w:rPr>
+        <w:tab/>
+      </w:r>
+      <w:r>
+        <w:rPr>
+          <w:rFonts w:ascii="Times New Roman" w:hAnsi="Times New Roman" w:cs="Times New Roman"/>
+          <w:sz w:val="28"/>
+          <w:szCs w:val="28"/>
+        </w:rPr>
+        <w:t xml:space="preserve">40</w:t>
+      </w:r>
+    </w:p>
+    <w:p>
+      <w:pPr>
+        <w:pStyle w:val="TOC3"/>
+        <w:tabs>
+          <w:tab w:val="right" w:leader="dot" w:pos="9355"/>
+        </w:tabs>
+        <w:spacing w:after="60" w:line="360" w:lineRule="auto"/>
+      </w:pPr>
+      <w:r>
+        <w:rPr>
+          <w:rFonts w:ascii="Times New Roman" w:hAnsi="Times New Roman" w:cs="Times New Roman"/>
+          <w:sz w:val="28"/>
+          <w:szCs w:val="28"/>
+        </w:rPr>
+        <w:t xml:space="preserve">7.2.4 Analysis — Why Did It Happen This Way?</w:t>
+      </w:r>
+      <w:r>
+        <w:rPr>
+          <w:rFonts w:ascii="Times New Roman" w:hAnsi="Times New Roman"/>
+          <w:sz w:val="28"/>
+        </w:rPr>
+        <w:tab/>
+      </w:r>
+      <w:r>
+        <w:rPr>
+          <w:rFonts w:ascii="Times New Roman" w:hAnsi="Times New Roman" w:cs="Times New Roman"/>
+          <w:sz w:val="28"/>
+          <w:szCs w:val="28"/>
+        </w:rPr>
+        <w:t xml:space="preserve">41</w:t>
+      </w:r>
+    </w:p>
+    <w:p>
+      <w:pPr>
+        <w:pStyle w:val="TOC3"/>
+        <w:tabs>
+          <w:tab w:val="right" w:leader="dot" w:pos="9355"/>
+        </w:tabs>
+        <w:spacing w:after="60" w:line="360" w:lineRule="auto"/>
+      </w:pPr>
+      <w:r>
+        <w:rPr>
+          <w:rFonts w:ascii="Times New Roman" w:hAnsi="Times New Roman" w:cs="Times New Roman"/>
+          <w:sz w:val="28"/>
+          <w:szCs w:val="28"/>
+        </w:rPr>
+        <w:t xml:space="preserve">7.2.5 Conclusion — What Did I Learn?</w:t>
+      </w:r>
+      <w:r>
+        <w:rPr>
+          <w:rFonts w:ascii="Times New Roman" w:hAnsi="Times New Roman"/>
+          <w:sz w:val="28"/>
+        </w:rPr>
+        <w:tab/>
+      </w:r>
+      <w:r>
+        <w:rPr>
+          <w:rFonts w:ascii="Times New Roman" w:hAnsi="Times New Roman" w:cs="Times New Roman"/>
+          <w:sz w:val="28"/>
+          <w:szCs w:val="28"/>
+        </w:rPr>
+        <w:t xml:space="preserve">41</w:t>
+      </w:r>
+    </w:p>
+    <w:p>
+      <w:pPr>
+        <w:pStyle w:val="TOC3"/>
+        <w:tabs>
+          <w:tab w:val="right" w:leader="dot" w:pos="9355"/>
+        </w:tabs>
+        <w:spacing w:after="60" w:line="360" w:lineRule="auto"/>
+      </w:pPr>
+      <w:r>
+        <w:rPr>
+          <w:rFonts w:ascii="Times New Roman" w:hAnsi="Times New Roman" w:cs="Times New Roman"/>
+          <w:sz w:val="28"/>
+          <w:szCs w:val="28"/>
+        </w:rPr>
+        <w:t xml:space="preserve">7.2.6 Action Plan — What Will I Do Differently?</w:t>
+      </w:r>
+      <w:r>
+        <w:rPr>
+          <w:rFonts w:ascii="Times New Roman" w:hAnsi="Times New Roman"/>
+          <w:sz w:val="28"/>
+        </w:rPr>
+        <w:tab/>
+      </w:r>
+      <w:r>
+        <w:rPr>
+          <w:rFonts w:ascii="Times New Roman" w:hAnsi="Times New Roman" w:cs="Times New Roman"/>
+          <w:sz w:val="28"/>
+          <w:szCs w:val="28"/>
+        </w:rPr>
+        <w:t xml:space="preserve">41</w:t>
+      </w:r>
+    </w:p>
+    <w:p>
+      <w:pPr>
+        <w:pStyle w:val="TOC2"/>
+        <w:tabs>
+          <w:tab w:val="right" w:leader="dot" w:pos="9355"/>
+        </w:tabs>
+        <w:spacing w:after="60" w:line="360" w:lineRule="auto"/>
+      </w:pPr>
+      <w:r>
+        <w:rPr>
+          <w:rFonts w:ascii="Times New Roman" w:hAnsi="Times New Roman" w:cs="Times New Roman"/>
+          <w:sz w:val="28"/>
+          <w:szCs w:val="28"/>
+        </w:rPr>
+        <w:t xml:space="preserve">7.3 SWOT Analysis of Personal Development</w:t>
+      </w:r>
+      <w:r>
+        <w:rPr>
+          <w:rFonts w:ascii="Times New Roman" w:hAnsi="Times New Roman"/>
+          <w:sz w:val="28"/>
+        </w:rPr>
+        <w:tab/>
+      </w:r>
+      <w:r>
+        <w:rPr>
+          <w:rFonts w:ascii="Times New Roman" w:hAnsi="Times New Roman" w:cs="Times New Roman"/>
+          <w:sz w:val="28"/>
+          <w:szCs w:val="28"/>
+        </w:rPr>
+        <w:t xml:space="preserve">41</w:t>
+      </w:r>
+    </w:p>
+    <w:p>
+      <w:pPr>
+        <w:pStyle w:val="TOC2"/>
+        <w:tabs>
+          <w:tab w:val="right" w:leader="dot" w:pos="9355"/>
+        </w:tabs>
+        <w:spacing w:after="60" w:line="360" w:lineRule="auto"/>
+      </w:pPr>
+      <w:r>
+        <w:rPr>
+          <w:rFonts w:ascii="Times New Roman" w:hAnsi="Times New Roman" w:cs="Times New Roman"/>
+          <w:sz w:val="28"/>
+          <w:szCs w:val="28"/>
+        </w:rPr>
+        <w:t xml:space="preserve">7.4 Transferable Skills Gained</w:t>
+      </w:r>
+      <w:r>
+        <w:rPr>
+          <w:rFonts w:ascii="Times New Roman" w:hAnsi="Times New Roman"/>
+          <w:sz w:val="28"/>
+        </w:rPr>
+        <w:tab/>
+      </w:r>
+      <w:r>
+        <w:rPr>
+          <w:rFonts w:ascii="Times New Roman" w:hAnsi="Times New Roman" w:cs="Times New Roman"/>
+          <w:sz w:val="28"/>
+          <w:szCs w:val="28"/>
+        </w:rPr>
+        <w:t xml:space="preserve">42</w:t>
+      </w:r>
+    </w:p>
+    <w:p>
+      <w:pPr>
+        <w:pStyle w:val="TOC2"/>
+        <w:tabs>
+          <w:tab w:val="right" w:leader="dot" w:pos="9355"/>
+        </w:tabs>
+        <w:spacing w:after="60" w:line="360" w:lineRule="auto"/>
+      </w:pPr>
+      <w:r>
+        <w:rPr>
+          <w:rFonts w:ascii="Times New Roman" w:hAnsi="Times New Roman" w:cs="Times New Roman"/>
+          <w:sz w:val="28"/>
+          <w:szCs w:val="28"/>
+        </w:rPr>
+        <w:t xml:space="preserve">7.5 Future Development Plan</w:t>
+      </w:r>
+      <w:r>
+        <w:rPr>
+          <w:rFonts w:ascii="Times New Roman" w:hAnsi="Times New Roman"/>
+          <w:sz w:val="28"/>
+        </w:rPr>
+        <w:tab/>
+      </w:r>
+      <w:r>
+        <w:rPr>
+          <w:rFonts w:ascii="Times New Roman" w:hAnsi="Times New Roman" w:cs="Times New Roman"/>
+          <w:sz w:val="28"/>
+          <w:szCs w:val="28"/>
+        </w:rPr>
+        <w:t xml:space="preserve">42</w:t>
+      </w:r>
+    </w:p>
+    <w:p>
+      <w:pPr>
+        <w:pStyle w:val="TOC1"/>
+        <w:tabs>
+          <w:tab w:val="right" w:leader="dot" w:pos="9355"/>
+        </w:tabs>
+        <w:spacing w:after="60" w:line="360" w:lineRule="auto"/>
+      </w:pPr>
+      <w:r>
+        <w:rPr>
+          <w:rFonts w:ascii="Times New Roman" w:hAnsi="Times New Roman" w:cs="Times New Roman"/>
+          <w:b/>
+          <w:sz w:val="28"/>
+          <w:szCs w:val="28"/>
+        </w:rPr>
+        <w:t xml:space="preserve">References</w:t>
+      </w:r>
+      <w:r>
+        <w:rPr>
+          <w:rFonts w:ascii="Times New Roman" w:hAnsi="Times New Roman"/>
+          <w:sz w:val="28"/>
+        </w:rPr>
+        <w:tab/>
+      </w:r>
+      <w:r>
+        <w:rPr>
+          <w:rFonts w:ascii="Times New Roman" w:hAnsi="Times New Roman" w:cs="Times New Roman"/>
+          <w:b/>
+          <w:sz w:val="28"/>
+          <w:szCs w:val="28"/>
+        </w:rPr>
+        <w:t xml:space="preserve">43</w:t>
+      </w:r>
+    </w:p>
+    <w:p>
+      <w:pPr>
+        <w:pStyle w:val="TOC1"/>
+        <w:tabs>
+          <w:tab w:val="right" w:leader="dot" w:pos="9355"/>
+        </w:tabs>
+        <w:spacing w:after="60" w:line="360" w:lineRule="auto"/>
+      </w:pPr>
+      <w:r>
+        <w:rPr>
+          <w:rFonts w:ascii="Times New Roman" w:hAnsi="Times New Roman" w:cs="Times New Roman"/>
+          <w:b/>
+          <w:sz w:val="28"/>
+          <w:szCs w:val="28"/>
+        </w:rPr>
+        <w:t xml:space="preserve">Appendices</w:t>
+      </w:r>
+      <w:r>
+        <w:rPr>
+          <w:rFonts w:ascii="Times New Roman" w:hAnsi="Times New Roman"/>
+          <w:sz w:val="28"/>
+        </w:rPr>
+        <w:tab/>
+      </w:r>
+      <w:r>
+        <w:rPr>
+          <w:rFonts w:ascii="Times New Roman" w:hAnsi="Times New Roman" w:cs="Times New Roman"/>
+          <w:b/>
+          <w:sz w:val="28"/>
+          <w:szCs w:val="28"/>
+        </w:rPr>
+        <w:t xml:space="preserve">45</w:t>
+      </w:r>
+    </w:p>
+    <w:p>
+      <w:pPr>
+        <w:pStyle w:val="TOC2"/>
+        <w:tabs>
+          <w:tab w:val="right" w:leader="dot" w:pos="9355"/>
+        </w:tabs>
+        <w:spacing w:after="60" w:line="360" w:lineRule="auto"/>
+      </w:pPr>
+      <w:r>
+        <w:rPr>
+          <w:rFonts w:ascii="Times New Roman" w:hAnsi="Times New Roman" w:cs="Times New Roman"/>
+          <w:sz w:val="28"/>
+          <w:szCs w:val="28"/>
+        </w:rPr>
+        <w:t xml:space="preserve">Appendix A — Project Proposal (Approved Version)</w:t>
+      </w:r>
+      <w:r>
+        <w:rPr>
+          <w:rFonts w:ascii="Times New Roman" w:hAnsi="Times New Roman"/>
+          <w:sz w:val="28"/>
+        </w:rPr>
+        <w:tab/>
+      </w:r>
+      <w:r>
+        <w:rPr>
+          <w:rFonts w:ascii="Times New Roman" w:hAnsi="Times New Roman" w:cs="Times New Roman"/>
+          <w:sz w:val="28"/>
+          <w:szCs w:val="28"/>
+        </w:rPr>
+        <w:t xml:space="preserve">45</w:t>
+      </w:r>
+    </w:p>
+    <w:p>
+      <w:pPr>
+        <w:pStyle w:val="TOC2"/>
+        <w:tabs>
+          <w:tab w:val="right" w:leader="dot" w:pos="9355"/>
+        </w:tabs>
+        <w:spacing w:after="60" w:line="360" w:lineRule="auto"/>
+      </w:pPr>
+      <w:r>
+        <w:rPr>
+          <w:rFonts w:ascii="Times New Roman" w:hAnsi="Times New Roman" w:cs="Times New Roman"/>
+          <w:sz w:val="28"/>
+          <w:szCs w:val="28"/>
+        </w:rPr>
+        <w:t xml:space="preserve">Appendix B — Full Gantt Chart</w:t>
+      </w:r>
+      <w:r>
+        <w:rPr>
+          <w:rFonts w:ascii="Times New Roman" w:hAnsi="Times New Roman"/>
+          <w:sz w:val="28"/>
+        </w:rPr>
+        <w:tab/>
+      </w:r>
+      <w:r>
+        <w:rPr>
+          <w:rFonts w:ascii="Times New Roman" w:hAnsi="Times New Roman" w:cs="Times New Roman"/>
+          <w:sz w:val="28"/>
+          <w:szCs w:val="28"/>
+        </w:rPr>
+        <w:t xml:space="preserve">45</w:t>
+      </w:r>
+    </w:p>
+    <w:p>
+      <w:pPr>
+        <w:pStyle w:val="TOC2"/>
+        <w:tabs>
+          <w:tab w:val="right" w:leader="dot" w:pos="9355"/>
+        </w:tabs>
+        <w:spacing w:after="60" w:line="360" w:lineRule="auto"/>
+      </w:pPr>
+      <w:r>
+        <w:rPr>
+          <w:rFonts w:ascii="Times New Roman" w:hAnsi="Times New Roman" w:cs="Times New Roman"/>
+          <w:sz w:val="28"/>
+          <w:szCs w:val="28"/>
+        </w:rPr>
+        <w:t xml:space="preserve">Appendix C — Risk Register (Full Version)</w:t>
+      </w:r>
+      <w:r>
+        <w:rPr>
+          <w:rFonts w:ascii="Times New Roman" w:hAnsi="Times New Roman"/>
+          <w:sz w:val="28"/>
+        </w:rPr>
+        <w:tab/>
+      </w:r>
+      <w:r>
+        <w:rPr>
+          <w:rFonts w:ascii="Times New Roman" w:hAnsi="Times New Roman" w:cs="Times New Roman"/>
+          <w:sz w:val="28"/>
+          <w:szCs w:val="28"/>
+        </w:rPr>
+        <w:t xml:space="preserve">45</w:t>
+      </w:r>
+    </w:p>
+    <w:p>
+      <w:pPr>
+        <w:pStyle w:val="TOC2"/>
+        <w:tabs>
+          <w:tab w:val="right" w:leader="dot" w:pos="9355"/>
+        </w:tabs>
+        <w:spacing w:after="60" w:line="360" w:lineRule="auto"/>
+      </w:pPr>
+      <w:r>
+        <w:rPr>
+          <w:rFonts w:ascii="Times New Roman" w:hAnsi="Times New Roman" w:cs="Times New Roman"/>
+          <w:sz w:val="28"/>
+          <w:szCs w:val="28"/>
+        </w:rPr>
+        <w:t xml:space="preserve">Appendix D — Ethics Checklist</w:t>
+      </w:r>
+      <w:r>
+        <w:rPr>
+          <w:rFonts w:ascii="Times New Roman" w:hAnsi="Times New Roman"/>
+          <w:sz w:val="28"/>
+        </w:rPr>
+        <w:tab/>
+      </w:r>
+      <w:r>
+        <w:rPr>
+          <w:rFonts w:ascii="Times New Roman" w:hAnsi="Times New Roman" w:cs="Times New Roman"/>
+          <w:sz w:val="28"/>
+          <w:szCs w:val="28"/>
+        </w:rPr>
+        <w:t xml:space="preserve">45</w:t>
+      </w:r>
+    </w:p>
+    <w:p>
+      <w:pPr>
+        <w:pStyle w:val="TOC2"/>
+        <w:tabs>
+          <w:tab w:val="right" w:leader="dot" w:pos="9355"/>
+        </w:tabs>
+        <w:spacing w:after="60" w:line="360" w:lineRule="auto"/>
+      </w:pPr>
+      <w:r>
+        <w:rPr>
+          <w:rFonts w:ascii="Times New Roman" w:hAnsi="Times New Roman" w:cs="Times New Roman"/>
+          <w:sz w:val="28"/>
+          <w:szCs w:val="28"/>
+        </w:rPr>
+        <w:t xml:space="preserve">Appendix E — Data Collection Instruments</w:t>
+      </w:r>
+      <w:r>
+        <w:rPr>
+          <w:rFonts w:ascii="Times New Roman" w:hAnsi="Times New Roman"/>
+          <w:sz w:val="28"/>
+        </w:rPr>
+        <w:tab/>
+      </w:r>
+      <w:r>
+        <w:rPr>
+          <w:rFonts w:ascii="Times New Roman" w:hAnsi="Times New Roman" w:cs="Times New Roman"/>
+          <w:sz w:val="28"/>
+          <w:szCs w:val="28"/>
+        </w:rPr>
+        <w:t xml:space="preserve">45</w:t>
+      </w:r>
+    </w:p>
+    <w:p>
+      <w:pPr>
+        <w:pStyle w:val="TOC2"/>
+        <w:tabs>
+          <w:tab w:val="right" w:leader="dot" w:pos="9355"/>
+        </w:tabs>
+        <w:spacing w:after="60" w:line="360" w:lineRule="auto"/>
+      </w:pPr>
+      <w:r>
+        <w:rPr>
+          <w:rFonts w:ascii="Times New Roman" w:hAnsi="Times New Roman" w:cs="Times New Roman"/>
+          <w:sz w:val="28"/>
+          <w:szCs w:val="28"/>
+        </w:rPr>
+        <w:t xml:space="preserve">Appendix F — Code and Reproducibility</w:t>
+      </w:r>
+      <w:r>
+        <w:rPr>
+          <w:rFonts w:ascii="Times New Roman" w:hAnsi="Times New Roman"/>
+          <w:sz w:val="28"/>
+        </w:rPr>
+        <w:tab/>
+      </w:r>
+      <w:r>
+        <w:rPr>
+          <w:rFonts w:ascii="Times New Roman" w:hAnsi="Times New Roman" w:cs="Times New Roman"/>
+          <w:sz w:val="28"/>
+          <w:szCs w:val="28"/>
+        </w:rPr>
+        <w:t xml:space="preserve">45</w:t>
+      </w:r>
+    </w:p>
+    <w:p>
+      <w:pPr>
+        <w:pStyle w:val="TOC2"/>
+        <w:tabs>
+          <w:tab w:val="right" w:leader="dot" w:pos="9355"/>
+        </w:tabs>
+        <w:spacing w:after="60" w:line="360" w:lineRule="auto"/>
+      </w:pPr>
+      <w:r>
+        <w:rPr>
+          <w:rFonts w:ascii="Times New Roman" w:hAnsi="Times New Roman" w:cs="Times New Roman"/>
+          <w:sz w:val="28"/>
+          <w:szCs w:val="28"/>
+        </w:rPr>
+        <w:t xml:space="preserve">Appendix G — Project Logbook Extracts</w:t>
+      </w:r>
+      <w:r>
+        <w:rPr>
+          <w:rFonts w:ascii="Times New Roman" w:hAnsi="Times New Roman"/>
+          <w:sz w:val="28"/>
+        </w:rPr>
+        <w:tab/>
+      </w:r>
+      <w:r>
+        <w:rPr>
+          <w:rFonts w:ascii="Times New Roman" w:hAnsi="Times New Roman" w:cs="Times New Roman"/>
+          <w:sz w:val="28"/>
+          <w:szCs w:val="28"/>
+        </w:rPr>
+        <w:t xml:space="preserve">46</w:t>
+      </w:r>
+    </w:p>
+    <w:p>
+      <w:pPr>
+        <w:pStyle w:val="TOC2"/>
+        <w:tabs>
+          <w:tab w:val="right" w:leader="dot" w:pos="9355"/>
+        </w:tabs>
+        <w:spacing w:after="60" w:line="360" w:lineRule="auto"/>
+      </w:pPr>
+      <w:r>
+        <w:rPr>
+          <w:rFonts w:ascii="Times New Roman" w:hAnsi="Times New Roman" w:cs="Times New Roman"/>
+          <w:sz w:val="28"/>
+          <w:szCs w:val="28"/>
+        </w:rPr>
+        <w:t xml:space="preserve">Appendix H — Supervisor Meeting Records</w:t>
+      </w:r>
+      <w:r>
+        <w:rPr>
+          <w:rFonts w:ascii="Times New Roman" w:hAnsi="Times New Roman"/>
+          <w:sz w:val="28"/>
+        </w:rPr>
+        <w:tab/>
+      </w:r>
+      <w:r>
+        <w:rPr>
+          <w:rFonts w:ascii="Times New Roman" w:hAnsi="Times New Roman" w:cs="Times New Roman"/>
+          <w:sz w:val="28"/>
+          <w:szCs w:val="28"/>
+        </w:rPr>
+        <w:t xml:space="preserve">46</w:t>
+      </w:r>
+    </w:p>
+    <w:p>
+      <w:pPr>
+        <w:pStyle w:val="TOC2"/>
+        <w:tabs>
+          <w:tab w:val="right" w:leader="dot" w:pos="9355"/>
+        </w:tabs>
+        <w:spacing w:after="60" w:line="360" w:lineRule="auto"/>
+      </w:pPr>
+      <w:r>
+        <w:rPr>
+          <w:rFonts w:ascii="Times New Roman" w:hAnsi="Times New Roman" w:cs="Times New Roman"/>
+          <w:sz w:val="28"/>
+          <w:szCs w:val="28"/>
+        </w:rPr>
+        <w:t xml:space="preserve">Appendix I — Assessment Criteria Mapping</w:t>
+      </w:r>
+      <w:r>
+        <w:rPr>
+          <w:rFonts w:ascii="Times New Roman" w:hAnsi="Times New Roman"/>
+          <w:sz w:val="28"/>
+        </w:rPr>
+        <w:tab/>
+      </w:r>
+      <w:r>
+        <w:rPr>
+          <w:rFonts w:ascii="Times New Roman" w:hAnsi="Times New Roman" w:cs="Times New Roman"/>
+          <w:sz w:val="28"/>
+          <w:szCs w:val="28"/>
+        </w:rPr>
+        <w:t xml:space="preserve">46</w:t>
       </w:r>
       <w:r>
         <w:fldChar w:fldCharType="end"/>
@@ -11048,5 +14108,41 @@
       <w:szCs w:val="28"/>
     </w:rPr>
   </w:style>
+  <w:style w:type="paragraph" w:styleId="TOC1">
+    <w:name w:val="toc 1"/>
+    <w:basedOn w:val="Normal"/>
+    <w:next w:val="Normal"/>
+    <w:pPr>
+      <w:spacing w:after="60"/>
+    </w:pPr>
+    <w:rPr>
+      <w:rFonts w:ascii="Times New Roman" w:hAnsi="Times New Roman"/>
+      <w:b/>
+    </w:rPr>
+  </w:style>
+  <w:style w:type="paragraph" w:styleId="TOC2">
+    <w:name w:val="toc 2"/>
+    <w:basedOn w:val="Normal"/>
+    <w:next w:val="Normal"/>
+    <w:pPr>
+      <w:spacing w:after="60"/>
+      <w:ind w:left="360"/>
+    </w:pPr>
+    <w:rPr>
+      <w:rFonts w:ascii="Times New Roman" w:hAnsi="Times New Roman"/>
+    </w:rPr>
+  </w:style>
+  <w:style w:type="paragraph" w:styleId="TOC3">
+    <w:name w:val="toc 3"/>
+    <w:basedOn w:val="Normal"/>
+    <w:next w:val="Normal"/>
+    <w:pPr>
+      <w:spacing w:after="60"/>
+      <w:ind w:left="720"/>
+    </w:pPr>
+    <w:rPr>
+      <w:rFonts w:ascii="Times New Roman" w:hAnsi="Times New Roman"/>
+    </w:rPr>
+  </w:style>
 </w:styles>
 </file>
</xml_diff>

<commit_message>
Embed 10 generated figures into thesis; add pure-Python image tooling
</commit_message>
<xml_diff>
--- a/thesis/Fake_News_Detection_Uzbek_BTEC_Thesis.docx
+++ b/thesis/Fake_News_Detection_Uzbek_BTEC_Thesis.docx
@@ -1,6 +1,6 @@
 
 <file path=word/document.xml><?xml version="1.0" encoding="utf-8"?>
-<w:document xmlns:w="http://schemas.openxmlformats.org/wordprocessingml/2006/main" xmlns:r="http://schemas.openxmlformats.org/officeDocument/2006/relationships">
+<w:document xmlns:w="http://schemas.openxmlformats.org/wordprocessingml/2006/main" xmlns:r="http://schemas.openxmlformats.org/officeDocument/2006/relationships" xmlns:wp="http://schemas.openxmlformats.org/drawingml/2006/wordprocessingDrawing" xmlns:a="http://schemas.openxmlformats.org/drawingml/2006/main" xmlns:pic="http://schemas.openxmlformats.org/drawingml/2006/picture">
   <w:body>
     <w:p>
       <w:pPr>
@@ -1466,7 +1466,7 @@
           <w:sz w:val="28"/>
           <w:szCs w:val="28"/>
         </w:rPr>
-        <w:t xml:space="preserve">23</w:t>
+        <w:t xml:space="preserve">24</w:t>
       </w:r>
     </w:p>
     <w:p>
@@ -1498,7 +1498,7 @@
           <w:sz w:val="28"/>
           <w:szCs w:val="28"/>
         </w:rPr>
-        <w:t xml:space="preserve">23</w:t>
+        <w:t xml:space="preserve">24</w:t>
       </w:r>
     </w:p>
     <w:p>
@@ -1530,7 +1530,7 @@
           <w:sz w:val="28"/>
           <w:szCs w:val="28"/>
         </w:rPr>
-        <w:t xml:space="preserve">23</w:t>
+        <w:t xml:space="preserve">24</w:t>
       </w:r>
     </w:p>
     <w:p>
@@ -1562,7 +1562,7 @@
           <w:sz w:val="28"/>
           <w:szCs w:val="28"/>
         </w:rPr>
-        <w:t xml:space="preserve">23</w:t>
+        <w:t xml:space="preserve">24</w:t>
       </w:r>
     </w:p>
     <w:p>
@@ -1594,7 +1594,7 @@
           <w:sz w:val="28"/>
           <w:szCs w:val="28"/>
         </w:rPr>
-        <w:t xml:space="preserve">24</w:t>
+        <w:t xml:space="preserve">25</w:t>
       </w:r>
     </w:p>
     <w:p>
@@ -1626,7 +1626,7 @@
           <w:sz w:val="28"/>
           <w:szCs w:val="28"/>
         </w:rPr>
-        <w:t xml:space="preserve">24</w:t>
+        <w:t xml:space="preserve">25</w:t>
       </w:r>
     </w:p>
     <w:p>
@@ -1658,7 +1658,7 @@
           <w:sz w:val="28"/>
           <w:szCs w:val="28"/>
         </w:rPr>
-        <w:t xml:space="preserve">24</w:t>
+        <w:t xml:space="preserve">26</w:t>
       </w:r>
     </w:p>
     <w:p>
@@ -1690,7 +1690,7 @@
           <w:sz w:val="28"/>
           <w:szCs w:val="28"/>
         </w:rPr>
-        <w:t xml:space="preserve">25</w:t>
+        <w:t xml:space="preserve">27</w:t>
       </w:r>
     </w:p>
     <w:p>
@@ -1722,7 +1722,7 @@
           <w:sz w:val="28"/>
           <w:szCs w:val="28"/>
         </w:rPr>
-        <w:t xml:space="preserve">25</w:t>
+        <w:t xml:space="preserve">27</w:t>
       </w:r>
     </w:p>
     <w:p>
@@ -1754,7 +1754,7 @@
           <w:sz w:val="28"/>
           <w:szCs w:val="28"/>
         </w:rPr>
-        <w:t xml:space="preserve">26</w:t>
+        <w:t xml:space="preserve">27</w:t>
       </w:r>
     </w:p>
     <w:p>
@@ -1786,7 +1786,7 @@
           <w:sz w:val="28"/>
           <w:szCs w:val="28"/>
         </w:rPr>
-        <w:t xml:space="preserve">26</w:t>
+        <w:t xml:space="preserve">28</w:t>
       </w:r>
     </w:p>
     <w:p>
@@ -1818,7 +1818,7 @@
           <w:sz w:val="28"/>
           <w:szCs w:val="28"/>
         </w:rPr>
-        <w:t xml:space="preserve">27</w:t>
+        <w:t xml:space="preserve">28</w:t>
       </w:r>
     </w:p>
     <w:p>
@@ -1850,7 +1850,7 @@
           <w:sz w:val="28"/>
           <w:szCs w:val="28"/>
         </w:rPr>
-        <w:t xml:space="preserve">27</w:t>
+        <w:t xml:space="preserve">29</w:t>
       </w:r>
     </w:p>
     <w:p>
@@ -1882,7 +1882,7 @@
           <w:sz w:val="28"/>
           <w:szCs w:val="28"/>
         </w:rPr>
-        <w:t xml:space="preserve">27</w:t>
+        <w:t xml:space="preserve">29</w:t>
       </w:r>
     </w:p>
     <w:p>
@@ -1916,7 +1916,7 @@
           <w:sz w:val="28"/>
           <w:szCs w:val="28"/>
         </w:rPr>
-        <w:t xml:space="preserve">28</w:t>
+        <w:t xml:space="preserve">30</w:t>
       </w:r>
     </w:p>
     <w:p>
@@ -1948,7 +1948,7 @@
           <w:sz w:val="28"/>
           <w:szCs w:val="28"/>
         </w:rPr>
-        <w:t xml:space="preserve">28</w:t>
+        <w:t xml:space="preserve">30</w:t>
       </w:r>
     </w:p>
     <w:p>
@@ -1980,7 +1980,7 @@
           <w:sz w:val="28"/>
           <w:szCs w:val="28"/>
         </w:rPr>
-        <w:t xml:space="preserve">28</w:t>
+        <w:t xml:space="preserve">30</w:t>
       </w:r>
     </w:p>
     <w:p>
@@ -2012,7 +2012,7 @@
           <w:sz w:val="28"/>
           <w:szCs w:val="28"/>
         </w:rPr>
-        <w:t xml:space="preserve">29</w:t>
+        <w:t xml:space="preserve">31</w:t>
       </w:r>
     </w:p>
     <w:p>
@@ -2044,7 +2044,7 @@
           <w:sz w:val="28"/>
           <w:szCs w:val="28"/>
         </w:rPr>
-        <w:t xml:space="preserve">29</w:t>
+        <w:t xml:space="preserve">31</w:t>
       </w:r>
     </w:p>
     <w:p>
@@ -2076,7 +2076,7 @@
           <w:sz w:val="28"/>
           <w:szCs w:val="28"/>
         </w:rPr>
-        <w:t xml:space="preserve">29</w:t>
+        <w:t xml:space="preserve">31</w:t>
       </w:r>
     </w:p>
     <w:p>
@@ -2108,7 +2108,7 @@
           <w:sz w:val="28"/>
           <w:szCs w:val="28"/>
         </w:rPr>
-        <w:t xml:space="preserve">30</w:t>
+        <w:t xml:space="preserve">32</w:t>
       </w:r>
     </w:p>
     <w:p>
@@ -2140,7 +2140,7 @@
           <w:sz w:val="28"/>
           <w:szCs w:val="28"/>
         </w:rPr>
-        <w:t xml:space="preserve">30</w:t>
+        <w:t xml:space="preserve">32</w:t>
       </w:r>
     </w:p>
     <w:p>
@@ -2172,7 +2172,7 @@
           <w:sz w:val="28"/>
           <w:szCs w:val="28"/>
         </w:rPr>
-        <w:t xml:space="preserve">30</w:t>
+        <w:t xml:space="preserve">33</w:t>
       </w:r>
     </w:p>
     <w:p>
@@ -2204,7 +2204,7 @@
           <w:sz w:val="28"/>
           <w:szCs w:val="28"/>
         </w:rPr>
-        <w:t xml:space="preserve">31</w:t>
+        <w:t xml:space="preserve">33</w:t>
       </w:r>
     </w:p>
     <w:p>
@@ -2236,7 +2236,7 @@
           <w:sz w:val="28"/>
           <w:szCs w:val="28"/>
         </w:rPr>
-        <w:t xml:space="preserve">31</w:t>
+        <w:t xml:space="preserve">33</w:t>
       </w:r>
     </w:p>
     <w:p>
@@ -2268,7 +2268,7 @@
           <w:sz w:val="28"/>
           <w:szCs w:val="28"/>
         </w:rPr>
-        <w:t xml:space="preserve">31</w:t>
+        <w:t xml:space="preserve">34</w:t>
       </w:r>
     </w:p>
     <w:p>
@@ -2300,7 +2300,7 @@
           <w:sz w:val="28"/>
           <w:szCs w:val="28"/>
         </w:rPr>
-        <w:t xml:space="preserve">32</w:t>
+        <w:t xml:space="preserve">36</w:t>
       </w:r>
     </w:p>
     <w:p>
@@ -2332,7 +2332,7 @@
           <w:sz w:val="28"/>
           <w:szCs w:val="28"/>
         </w:rPr>
-        <w:t xml:space="preserve">33</w:t>
+        <w:t xml:space="preserve">37</w:t>
       </w:r>
     </w:p>
     <w:p>
@@ -2364,7 +2364,7 @@
           <w:sz w:val="28"/>
           <w:szCs w:val="28"/>
         </w:rPr>
-        <w:t xml:space="preserve">33</w:t>
+        <w:t xml:space="preserve">38</w:t>
       </w:r>
     </w:p>
     <w:p>
@@ -2398,7 +2398,7 @@
           <w:sz w:val="28"/>
           <w:szCs w:val="28"/>
         </w:rPr>
-        <w:t xml:space="preserve">35</w:t>
+        <w:t xml:space="preserve">39</w:t>
       </w:r>
     </w:p>
     <w:p>
@@ -2430,7 +2430,7 @@
           <w:sz w:val="28"/>
           <w:szCs w:val="28"/>
         </w:rPr>
-        <w:t xml:space="preserve">35</w:t>
+        <w:t xml:space="preserve">39</w:t>
       </w:r>
     </w:p>
     <w:p>
@@ -2462,7 +2462,7 @@
           <w:sz w:val="28"/>
           <w:szCs w:val="28"/>
         </w:rPr>
-        <w:t xml:space="preserve">35</w:t>
+        <w:t xml:space="preserve">39</w:t>
       </w:r>
     </w:p>
     <w:p>
@@ -2494,7 +2494,7 @@
           <w:sz w:val="28"/>
           <w:szCs w:val="28"/>
         </w:rPr>
-        <w:t xml:space="preserve">36</w:t>
+        <w:t xml:space="preserve">40</w:t>
       </w:r>
     </w:p>
     <w:p>
@@ -2526,7 +2526,7 @@
           <w:sz w:val="28"/>
           <w:szCs w:val="28"/>
         </w:rPr>
-        <w:t xml:space="preserve">36</w:t>
+        <w:t xml:space="preserve">40</w:t>
       </w:r>
     </w:p>
     <w:p>
@@ -2558,7 +2558,7 @@
           <w:sz w:val="28"/>
           <w:szCs w:val="28"/>
         </w:rPr>
-        <w:t xml:space="preserve">36</w:t>
+        <w:t xml:space="preserve">40</w:t>
       </w:r>
     </w:p>
     <w:p>
@@ -2590,7 +2590,7 @@
           <w:sz w:val="28"/>
           <w:szCs w:val="28"/>
         </w:rPr>
-        <w:t xml:space="preserve">37</w:t>
+        <w:t xml:space="preserve">41</w:t>
       </w:r>
     </w:p>
     <w:p>
@@ -2622,7 +2622,7 @@
           <w:sz w:val="28"/>
           <w:szCs w:val="28"/>
         </w:rPr>
-        <w:t xml:space="preserve">37</w:t>
+        <w:t xml:space="preserve">41</w:t>
       </w:r>
     </w:p>
     <w:p>
@@ -2656,7 +2656,7 @@
           <w:sz w:val="28"/>
           <w:szCs w:val="28"/>
         </w:rPr>
-        <w:t xml:space="preserve">38</w:t>
+        <w:t xml:space="preserve">42</w:t>
       </w:r>
     </w:p>
     <w:p>
@@ -2688,7 +2688,7 @@
           <w:sz w:val="28"/>
           <w:szCs w:val="28"/>
         </w:rPr>
-        <w:t xml:space="preserve">38</w:t>
+        <w:t xml:space="preserve">42</w:t>
       </w:r>
     </w:p>
     <w:p>
@@ -2720,7 +2720,7 @@
           <w:sz w:val="28"/>
           <w:szCs w:val="28"/>
         </w:rPr>
-        <w:t xml:space="preserve">38</w:t>
+        <w:t xml:space="preserve">42</w:t>
       </w:r>
     </w:p>
     <w:p>
@@ -2752,7 +2752,7 @@
           <w:sz w:val="28"/>
           <w:szCs w:val="28"/>
         </w:rPr>
-        <w:t xml:space="preserve">38</w:t>
+        <w:t xml:space="preserve">42</w:t>
       </w:r>
     </w:p>
     <w:p>
@@ -2784,7 +2784,7 @@
           <w:sz w:val="28"/>
           <w:szCs w:val="28"/>
         </w:rPr>
-        <w:t xml:space="preserve">39</w:t>
+        <w:t xml:space="preserve">43</w:t>
       </w:r>
     </w:p>
     <w:p>
@@ -2816,7 +2816,7 @@
           <w:sz w:val="28"/>
           <w:szCs w:val="28"/>
         </w:rPr>
-        <w:t xml:space="preserve">39</w:t>
+        <w:t xml:space="preserve">43</w:t>
       </w:r>
     </w:p>
     <w:p>
@@ -2848,7 +2848,7 @@
           <w:sz w:val="28"/>
           <w:szCs w:val="28"/>
         </w:rPr>
-        <w:t xml:space="preserve">39</w:t>
+        <w:t xml:space="preserve">43</w:t>
       </w:r>
     </w:p>
     <w:p>
@@ -2880,7 +2880,7 @@
           <w:sz w:val="28"/>
           <w:szCs w:val="28"/>
         </w:rPr>
-        <w:t xml:space="preserve">39</w:t>
+        <w:t xml:space="preserve">43</w:t>
       </w:r>
     </w:p>
     <w:p>
@@ -2914,7 +2914,7 @@
           <w:sz w:val="28"/>
           <w:szCs w:val="28"/>
         </w:rPr>
-        <w:t xml:space="preserve">40</w:t>
+        <w:t xml:space="preserve">44</w:t>
       </w:r>
     </w:p>
     <w:p>
@@ -2946,7 +2946,7 @@
           <w:sz w:val="28"/>
           <w:szCs w:val="28"/>
         </w:rPr>
-        <w:t xml:space="preserve">40</w:t>
+        <w:t xml:space="preserve">44</w:t>
       </w:r>
     </w:p>
     <w:p>
@@ -2978,7 +2978,7 @@
           <w:sz w:val="28"/>
           <w:szCs w:val="28"/>
         </w:rPr>
-        <w:t xml:space="preserve">40</w:t>
+        <w:t xml:space="preserve">44</w:t>
       </w:r>
     </w:p>
     <w:p>
@@ -3010,7 +3010,7 @@
           <w:sz w:val="28"/>
           <w:szCs w:val="28"/>
         </w:rPr>
-        <w:t xml:space="preserve">40</w:t>
+        <w:t xml:space="preserve">44</w:t>
       </w:r>
     </w:p>
     <w:p>
@@ -3042,7 +3042,7 @@
           <w:sz w:val="28"/>
           <w:szCs w:val="28"/>
         </w:rPr>
-        <w:t xml:space="preserve">40</w:t>
+        <w:t xml:space="preserve">44</w:t>
       </w:r>
     </w:p>
     <w:p>
@@ -3074,7 +3074,7 @@
           <w:sz w:val="28"/>
           <w:szCs w:val="28"/>
         </w:rPr>
-        <w:t xml:space="preserve">40</w:t>
+        <w:t xml:space="preserve">44</w:t>
       </w:r>
     </w:p>
     <w:p>
@@ -3106,7 +3106,7 @@
           <w:sz w:val="28"/>
           <w:szCs w:val="28"/>
         </w:rPr>
-        <w:t xml:space="preserve">41</w:t>
+        <w:t xml:space="preserve">45</w:t>
       </w:r>
     </w:p>
     <w:p>
@@ -3138,7 +3138,7 @@
           <w:sz w:val="28"/>
           <w:szCs w:val="28"/>
         </w:rPr>
-        <w:t xml:space="preserve">41</w:t>
+        <w:t xml:space="preserve">45</w:t>
       </w:r>
     </w:p>
     <w:p>
@@ -3170,7 +3170,7 @@
           <w:sz w:val="28"/>
           <w:szCs w:val="28"/>
         </w:rPr>
-        <w:t xml:space="preserve">41</w:t>
+        <w:t xml:space="preserve">45</w:t>
       </w:r>
     </w:p>
     <w:p>
@@ -3202,7 +3202,7 @@
           <w:sz w:val="28"/>
           <w:szCs w:val="28"/>
         </w:rPr>
-        <w:t xml:space="preserve">41</w:t>
+        <w:t xml:space="preserve">45</w:t>
       </w:r>
     </w:p>
     <w:p>
@@ -3234,7 +3234,7 @@
           <w:sz w:val="28"/>
           <w:szCs w:val="28"/>
         </w:rPr>
-        <w:t xml:space="preserve">42</w:t>
+        <w:t xml:space="preserve">46</w:t>
       </w:r>
     </w:p>
     <w:p>
@@ -3266,7 +3266,7 @@
           <w:sz w:val="28"/>
           <w:szCs w:val="28"/>
         </w:rPr>
-        <w:t xml:space="preserve">42</w:t>
+        <w:t xml:space="preserve">46</w:t>
       </w:r>
     </w:p>
     <w:p>
@@ -3300,7 +3300,7 @@
           <w:sz w:val="28"/>
           <w:szCs w:val="28"/>
         </w:rPr>
-        <w:t xml:space="preserve">43</w:t>
+        <w:t xml:space="preserve">47</w:t>
       </w:r>
     </w:p>
     <w:p>
@@ -3334,7 +3334,7 @@
           <w:sz w:val="28"/>
           <w:szCs w:val="28"/>
         </w:rPr>
-        <w:t xml:space="preserve">45</w:t>
+        <w:t xml:space="preserve">49</w:t>
       </w:r>
     </w:p>
     <w:p>
@@ -3366,7 +3366,7 @@
           <w:sz w:val="28"/>
           <w:szCs w:val="28"/>
         </w:rPr>
-        <w:t xml:space="preserve">45</w:t>
+        <w:t xml:space="preserve">49</w:t>
       </w:r>
     </w:p>
     <w:p>
@@ -3398,7 +3398,7 @@
           <w:sz w:val="28"/>
           <w:szCs w:val="28"/>
         </w:rPr>
-        <w:t xml:space="preserve">45</w:t>
+        <w:t xml:space="preserve">49</w:t>
       </w:r>
     </w:p>
     <w:p>
@@ -3430,7 +3430,7 @@
           <w:sz w:val="28"/>
           <w:szCs w:val="28"/>
         </w:rPr>
-        <w:t xml:space="preserve">45</w:t>
+        <w:t xml:space="preserve">49</w:t>
       </w:r>
     </w:p>
     <w:p>
@@ -3462,7 +3462,7 @@
           <w:sz w:val="28"/>
           <w:szCs w:val="28"/>
         </w:rPr>
-        <w:t xml:space="preserve">45</w:t>
+        <w:t xml:space="preserve">49</w:t>
       </w:r>
     </w:p>
     <w:p>
@@ -3494,7 +3494,7 @@
           <w:sz w:val="28"/>
           <w:szCs w:val="28"/>
         </w:rPr>
-        <w:t xml:space="preserve">45</w:t>
+        <w:t xml:space="preserve">49</w:t>
       </w:r>
     </w:p>
     <w:p>
@@ -3526,7 +3526,7 @@
           <w:sz w:val="28"/>
           <w:szCs w:val="28"/>
         </w:rPr>
-        <w:t xml:space="preserve">45</w:t>
+        <w:t xml:space="preserve">49</w:t>
       </w:r>
     </w:p>
     <w:p>
@@ -3558,7 +3558,7 @@
           <w:sz w:val="28"/>
           <w:szCs w:val="28"/>
         </w:rPr>
-        <w:t xml:space="preserve">46</w:t>
+        <w:t xml:space="preserve">50</w:t>
       </w:r>
     </w:p>
     <w:p>
@@ -3590,7 +3590,7 @@
           <w:sz w:val="28"/>
           <w:szCs w:val="28"/>
         </w:rPr>
-        <w:t xml:space="preserve">46</w:t>
+        <w:t xml:space="preserve">50</w:t>
       </w:r>
     </w:p>
     <w:p>
@@ -3622,7 +3622,7 @@
           <w:sz w:val="28"/>
           <w:szCs w:val="28"/>
         </w:rPr>
-        <w:t xml:space="preserve">46</w:t>
+        <w:t xml:space="preserve">50</w:t>
       </w:r>
       <w:r>
         <w:fldChar w:fldCharType="end"/>
@@ -6003,6 +6003,49 @@
     </w:p>
     <w:p>
       <w:pPr>
+        <w:jc w:val="center"/>
+        <w:spacing w:before="160" w:after="40" w:line="240" w:lineRule="auto"/>
+      </w:pPr>
+      <w:r>
+        <w:drawing>
+          <wp:inline distT="0" distB="0" distL="0" distR="0">
+            <wp:extent cx="5394960" cy="2023110"/>
+            <wp:effectExtent l="0" t="0" r="0" b="0"/>
+            <wp:docPr id="1" name="Picture 1"/>
+            <wp:cNvGraphicFramePr>
+              <a:graphicFrameLocks xmlns:a="http://schemas.openxmlformats.org/drawingml/2006/main" noChangeAspect="1"/>
+            </wp:cNvGraphicFramePr>
+            <a:graphic xmlns:a="http://schemas.openxmlformats.org/drawingml/2006/main">
+              <a:graphicData uri="http://schemas.openxmlformats.org/drawingml/2006/picture">
+                <pic:pic xmlns:pic="http://schemas.openxmlformats.org/drawingml/2006/picture">
+                  <pic:nvPicPr>
+                    <pic:cNvPr id="1" name="image1.png"/>
+                    <pic:cNvPicPr/>
+                  </pic:nvPicPr>
+                  <pic:blipFill>
+                    <a:blip r:embed="rId10"/>
+                    <a:stretch>
+                      <a:fillRect/>
+                    </a:stretch>
+                  </pic:blipFill>
+                  <pic:spPr>
+                    <a:xfrm>
+                      <a:off x="0" y="0"/>
+                      <a:ext cx="5394960" cy="2023110"/>
+                    </a:xfrm>
+                    <a:prstGeom prst="rect">
+                      <a:avLst/>
+                    </a:prstGeom>
+                  </pic:spPr>
+                </pic:pic>
+              </a:graphicData>
+            </a:graphic>
+          </wp:inline>
+        </w:drawing>
+      </w:r>
+    </w:p>
+    <w:p>
+      <w:pPr>
         <w:spacing w:before="0" w:after="160" w:line="240" w:lineRule="auto"/>
         <w:jc w:val="center"/>
       </w:pPr>
@@ -6013,7 +6056,7 @@
           <w:sz w:val="22"/>
           <w:szCs w:val="22"/>
         </w:rPr>
-        <w:t xml:space="preserve">Figure 1. Conceptual framework linking the preprocessing, feature, modelling and evaluation layers (see code/results/figures/).</w:t>
+        <w:t xml:space="preserve">Figure 1. Conceptual framework linking the preprocessing, feature, modelling and evaluation layers.</w:t>
       </w:r>
     </w:p>
     <w:p>
@@ -6361,6 +6404,49 @@
     </w:p>
     <w:p>
       <w:pPr>
+        <w:jc w:val="center"/>
+        <w:spacing w:before="160" w:after="40" w:line="240" w:lineRule="auto"/>
+      </w:pPr>
+      <w:r>
+        <w:drawing>
+          <wp:inline distT="0" distB="0" distL="0" distR="0">
+            <wp:extent cx="5394960" cy="2360295"/>
+            <wp:effectExtent l="0" t="0" r="0" b="0"/>
+            <wp:docPr id="2" name="Picture 2"/>
+            <wp:cNvGraphicFramePr>
+              <a:graphicFrameLocks xmlns:a="http://schemas.openxmlformats.org/drawingml/2006/main" noChangeAspect="1"/>
+            </wp:cNvGraphicFramePr>
+            <a:graphic xmlns:a="http://schemas.openxmlformats.org/drawingml/2006/main">
+              <a:graphicData uri="http://schemas.openxmlformats.org/drawingml/2006/picture">
+                <pic:pic xmlns:pic="http://schemas.openxmlformats.org/drawingml/2006/picture">
+                  <pic:nvPicPr>
+                    <pic:cNvPr id="2" name="image2.png"/>
+                    <pic:cNvPicPr/>
+                  </pic:nvPicPr>
+                  <pic:blipFill>
+                    <a:blip r:embed="rId11"/>
+                    <a:stretch>
+                      <a:fillRect/>
+                    </a:stretch>
+                  </pic:blipFill>
+                  <pic:spPr>
+                    <a:xfrm>
+                      <a:off x="0" y="0"/>
+                      <a:ext cx="5394960" cy="2360295"/>
+                    </a:xfrm>
+                    <a:prstGeom prst="rect">
+                      <a:avLst/>
+                    </a:prstGeom>
+                  </pic:spPr>
+                </pic:pic>
+              </a:graphicData>
+            </a:graphic>
+          </wp:inline>
+        </w:drawing>
+      </w:r>
+    </w:p>
+    <w:p>
+      <w:pPr>
         <w:spacing w:before="0" w:after="160" w:line="240" w:lineRule="auto"/>
         <w:jc w:val="center"/>
       </w:pPr>
@@ -6371,7 +6457,7 @@
           <w:sz w:val="22"/>
           <w:szCs w:val="22"/>
         </w:rPr>
-        <w:t xml:space="preserve">Figure 2. Work Breakdown Structure of the project (see code/results/figures/).</w:t>
+        <w:t xml:space="preserve">Figure 2. Work Breakdown Structure of the project.</w:t>
       </w:r>
     </w:p>
     <w:p>
@@ -6995,6 +7081,49 @@
     </w:p>
     <w:p>
       <w:pPr>
+        <w:jc w:val="center"/>
+        <w:spacing w:before="160" w:after="40" w:line="240" w:lineRule="auto"/>
+      </w:pPr>
+      <w:r>
+        <w:drawing>
+          <wp:inline distT="0" distB="0" distL="0" distR="0">
+            <wp:extent cx="5394960" cy="2360295"/>
+            <wp:effectExtent l="0" t="0" r="0" b="0"/>
+            <wp:docPr id="3" name="Picture 3"/>
+            <wp:cNvGraphicFramePr>
+              <a:graphicFrameLocks xmlns:a="http://schemas.openxmlformats.org/drawingml/2006/main" noChangeAspect="1"/>
+            </wp:cNvGraphicFramePr>
+            <a:graphic xmlns:a="http://schemas.openxmlformats.org/drawingml/2006/main">
+              <a:graphicData uri="http://schemas.openxmlformats.org/drawingml/2006/picture">
+                <pic:pic xmlns:pic="http://schemas.openxmlformats.org/drawingml/2006/picture">
+                  <pic:nvPicPr>
+                    <pic:cNvPr id="3" name="image3.png"/>
+                    <pic:cNvPicPr/>
+                  </pic:nvPicPr>
+                  <pic:blipFill>
+                    <a:blip r:embed="rId12"/>
+                    <a:stretch>
+                      <a:fillRect/>
+                    </a:stretch>
+                  </pic:blipFill>
+                  <pic:spPr>
+                    <a:xfrm>
+                      <a:off x="0" y="0"/>
+                      <a:ext cx="5394960" cy="2360295"/>
+                    </a:xfrm>
+                    <a:prstGeom prst="rect">
+                      <a:avLst/>
+                    </a:prstGeom>
+                  </pic:spPr>
+                </pic:pic>
+              </a:graphicData>
+            </a:graphic>
+          </wp:inline>
+        </w:drawing>
+      </w:r>
+    </w:p>
+    <w:p>
+      <w:pPr>
         <w:spacing w:before="0" w:after="160" w:line="240" w:lineRule="auto"/>
         <w:jc w:val="center"/>
       </w:pPr>
@@ -7005,7 +7134,7 @@
           <w:sz w:val="22"/>
           <w:szCs w:val="22"/>
         </w:rPr>
-        <w:t xml:space="preserve">Figure 3. Gantt chart of the two-month project timeline (see code/results/figures/).</w:t>
+        <w:t xml:space="preserve">Figure 3. Gantt chart of the two-month project timeline.</w:t>
       </w:r>
     </w:p>
     <w:p>
@@ -8892,7 +9021,65 @@
           <w:sz w:val="28"/>
           <w:szCs w:val="28"/>
         </w:rPr>
-        <w:t xml:space="preserve"> vectors. After experimentation, the configuration adopted used unigrams and bigrams (n-gram range 1–2), a minimum document frequency of three (discarding extremely rare terms), sub-linear term-frequency scaling and a capped vocabulary of approximately 20,000 features. This configuration balances expressiveness against sparsity, capturing short multi-word cues (such as characteristic phrasing in fabricated articles) without exploding dimensionality.</w:t>
+        <w:t xml:space="preserve"> vectors. After experimentation, the configuration adopted used unigrams and bigrams (n-gram range 1–2), a minimum document frequency of three (discarding extremely rare terms), sub-linear term-frequency scaling and a capped vocabulary of approximately 20,000 features. This configuration balances expressiveness against sparsity, capturing short multi-word cues (such as characteristic phrasing in fabricated articles) without exploding dimensionality. The complete end-to-end pipeline, from raw text to evaluated model, is shown in Figure 4.</w:t>
+      </w:r>
+    </w:p>
+    <w:p>
+      <w:pPr>
+        <w:jc w:val="center"/>
+        <w:spacing w:before="160" w:after="40" w:line="240" w:lineRule="auto"/>
+      </w:pPr>
+      <w:r>
+        <w:drawing>
+          <wp:inline distT="0" distB="0" distL="0" distR="0">
+            <wp:extent cx="5394960" cy="2135505"/>
+            <wp:effectExtent l="0" t="0" r="0" b="0"/>
+            <wp:docPr id="4" name="Picture 4"/>
+            <wp:cNvGraphicFramePr>
+              <a:graphicFrameLocks xmlns:a="http://schemas.openxmlformats.org/drawingml/2006/main" noChangeAspect="1"/>
+            </wp:cNvGraphicFramePr>
+            <a:graphic xmlns:a="http://schemas.openxmlformats.org/drawingml/2006/main">
+              <a:graphicData uri="http://schemas.openxmlformats.org/drawingml/2006/picture">
+                <pic:pic xmlns:pic="http://schemas.openxmlformats.org/drawingml/2006/picture">
+                  <pic:nvPicPr>
+                    <pic:cNvPr id="4" name="image4.png"/>
+                    <pic:cNvPicPr/>
+                  </pic:nvPicPr>
+                  <pic:blipFill>
+                    <a:blip r:embed="rId13"/>
+                    <a:stretch>
+                      <a:fillRect/>
+                    </a:stretch>
+                  </pic:blipFill>
+                  <pic:spPr>
+                    <a:xfrm>
+                      <a:off x="0" y="0"/>
+                      <a:ext cx="5394960" cy="2135505"/>
+                    </a:xfrm>
+                    <a:prstGeom prst="rect">
+                      <a:avLst/>
+                    </a:prstGeom>
+                  </pic:spPr>
+                </pic:pic>
+              </a:graphicData>
+            </a:graphic>
+          </wp:inline>
+        </w:drawing>
+      </w:r>
+    </w:p>
+    <w:p>
+      <w:pPr>
+        <w:spacing w:before="0" w:after="160" w:line="240" w:lineRule="auto"/>
+        <w:jc w:val="center"/>
+      </w:pPr>
+      <w:r>
+        <w:rPr>
+          <w:rFonts w:ascii="Times New Roman" w:hAnsi="Times New Roman" w:cs="Times New Roman"/>
+          <w:i/>
+          <w:sz w:val="22"/>
+          <w:szCs w:val="22"/>
+        </w:rPr>
+        <w:t xml:space="preserve">Figure 4. End-to-end machine-learning pipeline architecture.</w:t>
       </w:r>
     </w:p>
     <w:p>
@@ -9403,6 +9590,49 @@
     </w:p>
     <w:p>
       <w:pPr>
+        <w:jc w:val="center"/>
+        <w:spacing w:before="160" w:after="40" w:line="240" w:lineRule="auto"/>
+      </w:pPr>
+      <w:r>
+        <w:drawing>
+          <wp:inline distT="0" distB="0" distL="0" distR="0">
+            <wp:extent cx="5394960" cy="3596640"/>
+            <wp:effectExtent l="0" t="0" r="0" b="0"/>
+            <wp:docPr id="5" name="Picture 5"/>
+            <wp:cNvGraphicFramePr>
+              <a:graphicFrameLocks xmlns:a="http://schemas.openxmlformats.org/drawingml/2006/main" noChangeAspect="1"/>
+            </wp:cNvGraphicFramePr>
+            <a:graphic xmlns:a="http://schemas.openxmlformats.org/drawingml/2006/main">
+              <a:graphicData uri="http://schemas.openxmlformats.org/drawingml/2006/picture">
+                <pic:pic xmlns:pic="http://schemas.openxmlformats.org/drawingml/2006/picture">
+                  <pic:nvPicPr>
+                    <pic:cNvPr id="5" name="image5.png"/>
+                    <pic:cNvPicPr/>
+                  </pic:nvPicPr>
+                  <pic:blipFill>
+                    <a:blip r:embed="rId14"/>
+                    <a:stretch>
+                      <a:fillRect/>
+                    </a:stretch>
+                  </pic:blipFill>
+                  <pic:spPr>
+                    <a:xfrm>
+                      <a:off x="0" y="0"/>
+                      <a:ext cx="5394960" cy="3596640"/>
+                    </a:xfrm>
+                    <a:prstGeom prst="rect">
+                      <a:avLst/>
+                    </a:prstGeom>
+                  </pic:spPr>
+                </pic:pic>
+              </a:graphicData>
+            </a:graphic>
+          </wp:inline>
+        </w:drawing>
+      </w:r>
+    </w:p>
+    <w:p>
+      <w:pPr>
         <w:spacing w:before="0" w:after="160" w:line="240" w:lineRule="auto"/>
         <w:jc w:val="center"/>
       </w:pPr>
@@ -9413,7 +9643,50 @@
           <w:sz w:val="22"/>
           <w:szCs w:val="22"/>
         </w:rPr>
-        <w:t xml:space="preserve">Figure 5. Class distribution of the Uzbek news corpus (see code/results/figures/).</w:t>
+        <w:t xml:space="preserve">Figure 5. Class distribution of the Uzbek news corpus.</w:t>
+      </w:r>
+    </w:p>
+    <w:p>
+      <w:pPr>
+        <w:jc w:val="center"/>
+        <w:spacing w:before="160" w:after="40" w:line="240" w:lineRule="auto"/>
+      </w:pPr>
+      <w:r>
+        <w:drawing>
+          <wp:inline distT="0" distB="0" distL="0" distR="0">
+            <wp:extent cx="5394960" cy="3158025"/>
+            <wp:effectExtent l="0" t="0" r="0" b="0"/>
+            <wp:docPr id="6" name="Picture 6"/>
+            <wp:cNvGraphicFramePr>
+              <a:graphicFrameLocks xmlns:a="http://schemas.openxmlformats.org/drawingml/2006/main" noChangeAspect="1"/>
+            </wp:cNvGraphicFramePr>
+            <a:graphic xmlns:a="http://schemas.openxmlformats.org/drawingml/2006/main">
+              <a:graphicData uri="http://schemas.openxmlformats.org/drawingml/2006/picture">
+                <pic:pic xmlns:pic="http://schemas.openxmlformats.org/drawingml/2006/picture">
+                  <pic:nvPicPr>
+                    <pic:cNvPr id="6" name="image6.png"/>
+                    <pic:cNvPicPr/>
+                  </pic:nvPicPr>
+                  <pic:blipFill>
+                    <a:blip r:embed="rId15"/>
+                    <a:stretch>
+                      <a:fillRect/>
+                    </a:stretch>
+                  </pic:blipFill>
+                  <pic:spPr>
+                    <a:xfrm>
+                      <a:off x="0" y="0"/>
+                      <a:ext cx="5394960" cy="3158025"/>
+                    </a:xfrm>
+                    <a:prstGeom prst="rect">
+                      <a:avLst/>
+                    </a:prstGeom>
+                  </pic:spPr>
+                </pic:pic>
+              </a:graphicData>
+            </a:graphic>
+          </wp:inline>
+        </w:drawing>
       </w:r>
     </w:p>
     <w:p>
@@ -9428,7 +9701,7 @@
           <w:sz w:val="22"/>
           <w:szCs w:val="22"/>
         </w:rPr>
-        <w:t xml:space="preserve">Figure 6. Document-length distribution for real and fake articles (see code/results/figures/).</w:t>
+        <w:t xml:space="preserve">Figure 6. Document-length distribution for real and fake articles.</w:t>
       </w:r>
     </w:p>
     <w:p>
@@ -10250,6 +10523,49 @@
     </w:p>
     <w:p>
       <w:pPr>
+        <w:jc w:val="center"/>
+        <w:spacing w:before="160" w:after="40" w:line="240" w:lineRule="auto"/>
+      </w:pPr>
+      <w:r>
+        <w:drawing>
+          <wp:inline distT="0" distB="0" distL="0" distR="0">
+            <wp:extent cx="5394960" cy="2972733"/>
+            <wp:effectExtent l="0" t="0" r="0" b="0"/>
+            <wp:docPr id="7" name="Picture 7"/>
+            <wp:cNvGraphicFramePr>
+              <a:graphicFrameLocks xmlns:a="http://schemas.openxmlformats.org/drawingml/2006/main" noChangeAspect="1"/>
+            </wp:cNvGraphicFramePr>
+            <a:graphic xmlns:a="http://schemas.openxmlformats.org/drawingml/2006/main">
+              <a:graphicData uri="http://schemas.openxmlformats.org/drawingml/2006/picture">
+                <pic:pic xmlns:pic="http://schemas.openxmlformats.org/drawingml/2006/picture">
+                  <pic:nvPicPr>
+                    <pic:cNvPr id="7" name="image7.png"/>
+                    <pic:cNvPicPr/>
+                  </pic:nvPicPr>
+                  <pic:blipFill>
+                    <a:blip r:embed="rId16"/>
+                    <a:stretch>
+                      <a:fillRect/>
+                    </a:stretch>
+                  </pic:blipFill>
+                  <pic:spPr>
+                    <a:xfrm>
+                      <a:off x="0" y="0"/>
+                      <a:ext cx="5394960" cy="2972733"/>
+                    </a:xfrm>
+                    <a:prstGeom prst="rect">
+                      <a:avLst/>
+                    </a:prstGeom>
+                  </pic:spPr>
+                </pic:pic>
+              </a:graphicData>
+            </a:graphic>
+          </wp:inline>
+        </w:drawing>
+      </w:r>
+    </w:p>
+    <w:p>
+      <w:pPr>
         <w:spacing w:before="0" w:after="160" w:line="240" w:lineRule="auto"/>
         <w:jc w:val="center"/>
       </w:pPr>
@@ -10260,7 +10576,7 @@
           <w:sz w:val="22"/>
           <w:szCs w:val="22"/>
         </w:rPr>
-        <w:t xml:space="preserve">Figure 7. Comparison of the five models across the five evaluation metrics (see code/results/figures/).</w:t>
+        <w:t xml:space="preserve">Figure 7. Comparison of the five models across the five evaluation metrics.</w:t>
       </w:r>
     </w:p>
     <w:p>
@@ -10788,6 +11104,49 @@
     </w:p>
     <w:p>
       <w:pPr>
+        <w:jc w:val="center"/>
+        <w:spacing w:before="160" w:after="40" w:line="240" w:lineRule="auto"/>
+      </w:pPr>
+      <w:r>
+        <w:drawing>
+          <wp:inline distT="0" distB="0" distL="0" distR="0">
+            <wp:extent cx="5394960" cy="5220929"/>
+            <wp:effectExtent l="0" t="0" r="0" b="0"/>
+            <wp:docPr id="8" name="Picture 8"/>
+            <wp:cNvGraphicFramePr>
+              <a:graphicFrameLocks xmlns:a="http://schemas.openxmlformats.org/drawingml/2006/main" noChangeAspect="1"/>
+            </wp:cNvGraphicFramePr>
+            <a:graphic xmlns:a="http://schemas.openxmlformats.org/drawingml/2006/main">
+              <a:graphicData uri="http://schemas.openxmlformats.org/drawingml/2006/picture">
+                <pic:pic xmlns:pic="http://schemas.openxmlformats.org/drawingml/2006/picture">
+                  <pic:nvPicPr>
+                    <pic:cNvPr id="8" name="image8.png"/>
+                    <pic:cNvPicPr/>
+                  </pic:nvPicPr>
+                  <pic:blipFill>
+                    <a:blip r:embed="rId17"/>
+                    <a:stretch>
+                      <a:fillRect/>
+                    </a:stretch>
+                  </pic:blipFill>
+                  <pic:spPr>
+                    <a:xfrm>
+                      <a:off x="0" y="0"/>
+                      <a:ext cx="5394960" cy="5220929"/>
+                    </a:xfrm>
+                    <a:prstGeom prst="rect">
+                      <a:avLst/>
+                    </a:prstGeom>
+                  </pic:spPr>
+                </pic:pic>
+              </a:graphicData>
+            </a:graphic>
+          </wp:inline>
+        </w:drawing>
+      </w:r>
+    </w:p>
+    <w:p>
+      <w:pPr>
         <w:spacing w:before="0" w:after="160" w:line="240" w:lineRule="auto"/>
         <w:jc w:val="center"/>
       </w:pPr>
@@ -10798,7 +11157,50 @@
           <w:sz w:val="22"/>
           <w:szCs w:val="22"/>
         </w:rPr>
-        <w:t xml:space="preserve">Figure 8. ROC curves for all five classifiers (see code/results/figures/).</w:t>
+        <w:t xml:space="preserve">Figure 8. ROC curves for all five classifiers.</w:t>
+      </w:r>
+    </w:p>
+    <w:p>
+      <w:pPr>
+        <w:jc w:val="center"/>
+        <w:spacing w:before="160" w:after="40" w:line="240" w:lineRule="auto"/>
+      </w:pPr>
+      <w:r>
+        <w:drawing>
+          <wp:inline distT="0" distB="0" distL="0" distR="0">
+            <wp:extent cx="5394960" cy="5394960"/>
+            <wp:effectExtent l="0" t="0" r="0" b="0"/>
+            <wp:docPr id="9" name="Picture 9"/>
+            <wp:cNvGraphicFramePr>
+              <a:graphicFrameLocks xmlns:a="http://schemas.openxmlformats.org/drawingml/2006/main" noChangeAspect="1"/>
+            </wp:cNvGraphicFramePr>
+            <a:graphic xmlns:a="http://schemas.openxmlformats.org/drawingml/2006/main">
+              <a:graphicData uri="http://schemas.openxmlformats.org/drawingml/2006/picture">
+                <pic:pic xmlns:pic="http://schemas.openxmlformats.org/drawingml/2006/picture">
+                  <pic:nvPicPr>
+                    <pic:cNvPr id="9" name="image9.png"/>
+                    <pic:cNvPicPr/>
+                  </pic:nvPicPr>
+                  <pic:blipFill>
+                    <a:blip r:embed="rId18"/>
+                    <a:stretch>
+                      <a:fillRect/>
+                    </a:stretch>
+                  </pic:blipFill>
+                  <pic:spPr>
+                    <a:xfrm>
+                      <a:off x="0" y="0"/>
+                      <a:ext cx="5394960" cy="5394960"/>
+                    </a:xfrm>
+                    <a:prstGeom prst="rect">
+                      <a:avLst/>
+                    </a:prstGeom>
+                  </pic:spPr>
+                </pic:pic>
+              </a:graphicData>
+            </a:graphic>
+          </wp:inline>
+        </w:drawing>
       </w:r>
     </w:p>
     <w:p>
@@ -10813,7 +11215,7 @@
           <w:sz w:val="22"/>
           <w:szCs w:val="22"/>
         </w:rPr>
-        <w:t xml:space="preserve">Figure 9. Confusion matrix of the best-performing model, Linear SVM (see code/results/figures/).</w:t>
+        <w:t xml:space="preserve">Figure 9. Confusion matrix of the best-performing model, Linear SVM.</w:t>
       </w:r>
     </w:p>
     <w:p>
@@ -11348,6 +11750,49 @@
     </w:p>
     <w:p>
       <w:pPr>
+        <w:jc w:val="center"/>
+        <w:spacing w:before="160" w:after="40" w:line="240" w:lineRule="auto"/>
+      </w:pPr>
+      <w:r>
+        <w:drawing>
+          <wp:inline distT="0" distB="0" distL="0" distR="0">
+            <wp:extent cx="5394960" cy="3158025"/>
+            <wp:effectExtent l="0" t="0" r="0" b="0"/>
+            <wp:docPr id="10" name="Picture 10"/>
+            <wp:cNvGraphicFramePr>
+              <a:graphicFrameLocks xmlns:a="http://schemas.openxmlformats.org/drawingml/2006/main" noChangeAspect="1"/>
+            </wp:cNvGraphicFramePr>
+            <a:graphic xmlns:a="http://schemas.openxmlformats.org/drawingml/2006/main">
+              <a:graphicData uri="http://schemas.openxmlformats.org/drawingml/2006/picture">
+                <pic:pic xmlns:pic="http://schemas.openxmlformats.org/drawingml/2006/picture">
+                  <pic:nvPicPr>
+                    <pic:cNvPr id="10" name="image10.png"/>
+                    <pic:cNvPicPr/>
+                  </pic:nvPicPr>
+                  <pic:blipFill>
+                    <a:blip r:embed="rId19"/>
+                    <a:stretch>
+                      <a:fillRect/>
+                    </a:stretch>
+                  </pic:blipFill>
+                  <pic:spPr>
+                    <a:xfrm>
+                      <a:off x="0" y="0"/>
+                      <a:ext cx="5394960" cy="3158025"/>
+                    </a:xfrm>
+                    <a:prstGeom prst="rect">
+                      <a:avLst/>
+                    </a:prstGeom>
+                  </pic:spPr>
+                </pic:pic>
+              </a:graphicData>
+            </a:graphic>
+          </wp:inline>
+        </w:drawing>
+      </w:r>
+    </w:p>
+    <w:p>
+      <w:pPr>
         <w:spacing w:before="0" w:after="160" w:line="240" w:lineRule="auto"/>
         <w:jc w:val="center"/>
       </w:pPr>
@@ -11358,7 +11803,7 @@
           <w:sz w:val="22"/>
           <w:szCs w:val="22"/>
         </w:rPr>
-        <w:t xml:space="preserve">Figure 10. Effect of TF-IDF vocabulary size on F1-score (see code/results/figures/).</w:t>
+        <w:t xml:space="preserve">Figure 10. Effect of TF-IDF vocabulary size on F1-score.</w:t>
       </w:r>
     </w:p>
     <w:p>

</xml_diff>